<commit_message>
Update task coordination workflows and project documentation
</commit_message>
<xml_diff>
--- a/docs/reports/20261009-technical-report/异构无人航行器集群任务规划与协同控制技术研究-正文.docx
+++ b/docs/reports/20261009-technical-report/异构无人航行器集群任务规划与协同控制技术研究-正文.docx
@@ -46,7 +46,7 @@
             </w:rPr>
             <w:fldChar w:fldCharType="separate"/>
           </w:r>
-          <w:hyperlink w:anchor="__RefHeading___Toc1789_851563711">
+          <w:hyperlink w:anchor="__RefHeading___Toc1778_4125612531">
             <w:r>
               <w:rPr>
                 <w:webHidden/>
@@ -72,7 +72,7 @@
             </w:tabs>
             <w:rPr/>
           </w:pPr>
-          <w:hyperlink w:anchor="__RefHeading___Toc1791_851563711">
+          <w:hyperlink w:anchor="__RefHeading___Toc1780_4125612531">
             <w:r>
               <w:rPr>
                 <w:webHidden/>
@@ -104,7 +104,7 @@
             </w:tabs>
             <w:rPr/>
           </w:pPr>
-          <w:hyperlink w:anchor="__RefHeading___Toc1793_851563711">
+          <w:hyperlink w:anchor="__RefHeading___Toc1782_4125612531">
             <w:r>
               <w:rPr>
                 <w:webHidden/>
@@ -136,7 +136,7 @@
             </w:tabs>
             <w:rPr/>
           </w:pPr>
-          <w:hyperlink w:anchor="__RefHeading___Toc1795_851563711">
+          <w:hyperlink w:anchor="__RefHeading___Toc1784_4125612531">
             <w:r>
               <w:rPr>
                 <w:webHidden/>
@@ -168,7 +168,7 @@
             </w:tabs>
             <w:rPr/>
           </w:pPr>
-          <w:hyperlink w:anchor="__RefHeading___Toc1797_851563711">
+          <w:hyperlink w:anchor="__RefHeading___Toc1786_4125612531">
             <w:r>
               <w:rPr>
                 <w:webHidden/>
@@ -187,7 +187,7 @@
                 <w:rStyle w:val="IndexLink"/>
               </w:rPr>
               <w:tab/>
-              <w:t>3</w:t>
+              <w:t>4</w:t>
             </w:r>
           </w:hyperlink>
         </w:p>
@@ -200,7 +200,7 @@
             </w:tabs>
             <w:rPr/>
           </w:pPr>
-          <w:hyperlink w:anchor="__RefHeading___Toc1799_851563711">
+          <w:hyperlink w:anchor="__RefHeading___Toc1788_4125612531">
             <w:r>
               <w:rPr>
                 <w:webHidden/>
@@ -219,7 +219,7 @@
                 <w:rStyle w:val="IndexLink"/>
               </w:rPr>
               <w:tab/>
-              <w:t>3</w:t>
+              <w:t>4</w:t>
             </w:r>
           </w:hyperlink>
         </w:p>
@@ -232,7 +232,7 @@
             </w:tabs>
             <w:rPr/>
           </w:pPr>
-          <w:hyperlink w:anchor="__RefHeading___Toc1801_851563711">
+          <w:hyperlink w:anchor="__RefHeading___Toc1790_4125612531">
             <w:r>
               <w:rPr>
                 <w:webHidden/>
@@ -251,7 +251,7 @@
                 <w:rStyle w:val="IndexLink"/>
               </w:rPr>
               <w:tab/>
-              <w:t>4</w:t>
+              <w:t>5</w:t>
             </w:r>
           </w:hyperlink>
         </w:p>
@@ -264,7 +264,7 @@
             </w:tabs>
             <w:rPr/>
           </w:pPr>
-          <w:hyperlink w:anchor="__RefHeading___Toc1803_851563711">
+          <w:hyperlink w:anchor="__RefHeading___Toc1792_4125612531">
             <w:r>
               <w:rPr>
                 <w:webHidden/>
@@ -296,7 +296,7 @@
             </w:tabs>
             <w:rPr/>
           </w:pPr>
-          <w:hyperlink w:anchor="__RefHeading___Toc1805_851563711">
+          <w:hyperlink w:anchor="__RefHeading___Toc1794_4125612531">
             <w:r>
               <w:rPr>
                 <w:webHidden/>
@@ -315,7 +315,7 @@
                 <w:rStyle w:val="IndexLink"/>
               </w:rPr>
               <w:tab/>
-              <w:t>5</w:t>
+              <w:t>6</w:t>
             </w:r>
           </w:hyperlink>
         </w:p>
@@ -328,7 +328,7 @@
             </w:tabs>
             <w:rPr/>
           </w:pPr>
-          <w:hyperlink w:anchor="__RefHeading___Toc1807_851563711">
+          <w:hyperlink w:anchor="__RefHeading___Toc1796_4125612531">
             <w:r>
               <w:rPr>
                 <w:webHidden/>
@@ -347,7 +347,7 @@
                 <w:rStyle w:val="IndexLink"/>
               </w:rPr>
               <w:tab/>
-              <w:t>5</w:t>
+              <w:t>6</w:t>
             </w:r>
           </w:hyperlink>
         </w:p>
@@ -360,7 +360,7 @@
             </w:tabs>
             <w:rPr/>
           </w:pPr>
-          <w:hyperlink w:anchor="__RefHeading___Toc1809_851563711">
+          <w:hyperlink w:anchor="__RefHeading___Toc1798_4125612531">
             <w:r>
               <w:rPr>
                 <w:webHidden/>
@@ -392,7 +392,7 @@
             </w:tabs>
             <w:rPr/>
           </w:pPr>
-          <w:hyperlink w:anchor="__RefHeading___Toc1811_851563711">
+          <w:hyperlink w:anchor="__RefHeading___Toc1800_4125612531">
             <w:r>
               <w:rPr>
                 <w:webHidden/>
@@ -411,7 +411,7 @@
                 <w:rStyle w:val="IndexLink"/>
               </w:rPr>
               <w:tab/>
-              <w:t>6</w:t>
+              <w:t>7</w:t>
             </w:r>
           </w:hyperlink>
         </w:p>
@@ -424,7 +424,7 @@
             </w:tabs>
             <w:rPr/>
           </w:pPr>
-          <w:hyperlink w:anchor="__RefHeading___Toc1813_851563711">
+          <w:hyperlink w:anchor="__RefHeading___Toc1802_4125612531">
             <w:r>
               <w:rPr>
                 <w:webHidden/>
@@ -456,7 +456,7 @@
             </w:tabs>
             <w:rPr/>
           </w:pPr>
-          <w:hyperlink w:anchor="__RefHeading___Toc1815_851563711">
+          <w:hyperlink w:anchor="__RefHeading___Toc1804_4125612531">
             <w:r>
               <w:rPr>
                 <w:webHidden/>
@@ -475,7 +475,7 @@
                 <w:rStyle w:val="IndexLink"/>
               </w:rPr>
               <w:tab/>
-              <w:t>7</w:t>
+              <w:t>8</w:t>
             </w:r>
           </w:hyperlink>
         </w:p>
@@ -488,7 +488,7 @@
             </w:tabs>
             <w:rPr/>
           </w:pPr>
-          <w:hyperlink w:anchor="__RefHeading___Toc1817_851563711">
+          <w:hyperlink w:anchor="__RefHeading___Toc1806_4125612531">
             <w:r>
               <w:rPr>
                 <w:webHidden/>
@@ -507,7 +507,7 @@
                 <w:rStyle w:val="IndexLink"/>
               </w:rPr>
               <w:tab/>
-              <w:t>7</w:t>
+              <w:t>8</w:t>
             </w:r>
           </w:hyperlink>
         </w:p>
@@ -520,7 +520,7 @@
             </w:tabs>
             <w:rPr/>
           </w:pPr>
-          <w:hyperlink w:anchor="__RefHeading___Toc1819_851563711">
+          <w:hyperlink w:anchor="__RefHeading___Toc1808_4125612531">
             <w:r>
               <w:rPr>
                 <w:webHidden/>
@@ -539,7 +539,7 @@
                 <w:rStyle w:val="IndexLink"/>
               </w:rPr>
               <w:tab/>
-              <w:t>7</w:t>
+              <w:t>8</w:t>
             </w:r>
           </w:hyperlink>
         </w:p>
@@ -552,7 +552,7 @@
             </w:tabs>
             <w:rPr/>
           </w:pPr>
-          <w:hyperlink w:anchor="__RefHeading___Toc1821_851563711">
+          <w:hyperlink w:anchor="__RefHeading___Toc1810_4125612531">
             <w:r>
               <w:rPr>
                 <w:webHidden/>
@@ -571,7 +571,7 @@
                 <w:rStyle w:val="IndexLink"/>
               </w:rPr>
               <w:tab/>
-              <w:t>8</w:t>
+              <w:t>9</w:t>
             </w:r>
           </w:hyperlink>
         </w:p>
@@ -584,7 +584,7 @@
             </w:tabs>
             <w:rPr/>
           </w:pPr>
-          <w:hyperlink w:anchor="__RefHeading___Toc1823_851563711">
+          <w:hyperlink w:anchor="__RefHeading___Toc1812_4125612531">
             <w:r>
               <w:rPr>
                 <w:webHidden/>
@@ -603,7 +603,7 @@
                 <w:rStyle w:val="IndexLink"/>
               </w:rPr>
               <w:tab/>
-              <w:t>8</w:t>
+              <w:t>9</w:t>
             </w:r>
           </w:hyperlink>
         </w:p>
@@ -616,7 +616,7 @@
             </w:tabs>
             <w:rPr/>
           </w:pPr>
-          <w:hyperlink w:anchor="__RefHeading___Toc1825_851563711">
+          <w:hyperlink w:anchor="__RefHeading___Toc1814_4125612531">
             <w:r>
               <w:rPr>
                 <w:webHidden/>
@@ -635,7 +635,7 @@
                 <w:rStyle w:val="IndexLink"/>
               </w:rPr>
               <w:tab/>
-              <w:t>9</w:t>
+              <w:t>10</w:t>
             </w:r>
           </w:hyperlink>
         </w:p>
@@ -648,7 +648,7 @@
             </w:tabs>
             <w:rPr/>
           </w:pPr>
-          <w:hyperlink w:anchor="__RefHeading___Toc1827_851563711">
+          <w:hyperlink w:anchor="__RefHeading___Toc1816_4125612531">
             <w:r>
               <w:rPr>
                 <w:webHidden/>
@@ -667,7 +667,7 @@
                 <w:rStyle w:val="IndexLink"/>
               </w:rPr>
               <w:tab/>
-              <w:t>9</w:t>
+              <w:t>10</w:t>
             </w:r>
           </w:hyperlink>
         </w:p>
@@ -680,7 +680,7 @@
             </w:tabs>
             <w:rPr/>
           </w:pPr>
-          <w:hyperlink w:anchor="__RefHeading___Toc1829_851563711">
+          <w:hyperlink w:anchor="__RefHeading___Toc1818_4125612531">
             <w:r>
               <w:rPr>
                 <w:webHidden/>
@@ -712,7 +712,7 @@
             </w:tabs>
             <w:rPr/>
           </w:pPr>
-          <w:hyperlink w:anchor="__RefHeading___Toc1831_851563711">
+          <w:hyperlink w:anchor="__RefHeading___Toc1820_4125612531">
             <w:r>
               <w:rPr>
                 <w:webHidden/>
@@ -731,7 +731,7 @@
                 <w:rStyle w:val="IndexLink"/>
               </w:rPr>
               <w:tab/>
-              <w:t>10</w:t>
+              <w:t>11</w:t>
             </w:r>
           </w:hyperlink>
         </w:p>
@@ -744,7 +744,7 @@
             </w:tabs>
             <w:rPr/>
           </w:pPr>
-          <w:hyperlink w:anchor="__RefHeading___Toc1833_851563711">
+          <w:hyperlink w:anchor="__RefHeading___Toc1822_4125612531">
             <w:r>
               <w:rPr>
                 <w:webHidden/>
@@ -756,7 +756,7 @@
               <w:rPr>
                 <w:rStyle w:val="IndexLink"/>
               </w:rPr>
-              <w:t>协同任务闭环的整体可行性分析</w:t>
+              <w:t>协同执行条件与任务完成分析</w:t>
             </w:r>
             <w:r>
               <w:rPr>
@@ -776,7 +776,7 @@
             </w:tabs>
             <w:rPr/>
           </w:pPr>
-          <w:hyperlink w:anchor="__RefHeading___Toc1835_851563711">
+          <w:hyperlink w:anchor="__RefHeading___Toc1824_4125612531">
             <w:r>
               <w:rPr>
                 <w:webHidden/>
@@ -808,7 +808,7 @@
             </w:tabs>
             <w:rPr/>
           </w:pPr>
-          <w:hyperlink w:anchor="__RefHeading___Toc1837_851563711">
+          <w:hyperlink w:anchor="__RefHeading___Toc1826_4125612531">
             <w:r>
               <w:rPr>
                 <w:webHidden/>
@@ -820,14 +820,14 @@
               <w:rPr>
                 <w:rStyle w:val="IndexLink"/>
               </w:rPr>
-              <w:t>从跟踪推导巡视有限完成</w:t>
+              <w:t>巡视进度与作业时长分析</w:t>
             </w:r>
             <w:r>
               <w:rPr>
                 <w:rStyle w:val="IndexLink"/>
               </w:rPr>
               <w:tab/>
-              <w:t>11</w:t>
+              <w:t>12</w:t>
             </w:r>
           </w:hyperlink>
         </w:p>
@@ -840,7 +840,7 @@
             </w:tabs>
             <w:rPr/>
           </w:pPr>
-          <w:hyperlink w:anchor="__RefHeading___Toc1839_851563711">
+          <w:hyperlink w:anchor="__RefHeading___Toc1828_4125612531">
             <w:r>
               <w:rPr>
                 <w:webHidden/>
@@ -852,14 +852,14 @@
               <w:rPr>
                 <w:rStyle w:val="IndexLink"/>
               </w:rPr>
-              <w:t>资源与计量不变量</w:t>
+              <w:t>资源占用与完成量计算</w:t>
             </w:r>
             <w:r>
               <w:rPr>
                 <w:rStyle w:val="IndexLink"/>
               </w:rPr>
               <w:tab/>
-              <w:t>12</w:t>
+              <w:t>13</w:t>
             </w:r>
           </w:hyperlink>
         </w:p>
@@ -872,7 +872,7 @@
             </w:tabs>
             <w:rPr/>
           </w:pPr>
-          <w:hyperlink w:anchor="__RefHeading___Toc1841_851563711">
+          <w:hyperlink w:anchor="__RefHeading___Toc1830_4125612531">
             <w:r>
               <w:rPr>
                 <w:webHidden/>
@@ -891,7 +891,7 @@
                 <w:rStyle w:val="IndexLink"/>
               </w:rPr>
               <w:tab/>
-              <w:t>12</w:t>
+              <w:t>13</w:t>
             </w:r>
           </w:hyperlink>
         </w:p>
@@ -904,7 +904,7 @@
             </w:tabs>
             <w:rPr/>
           </w:pPr>
-          <w:hyperlink w:anchor="__RefHeading___Toc1843_851563711">
+          <w:hyperlink w:anchor="__RefHeading___Toc1832_4125612531">
             <w:r>
               <w:rPr>
                 <w:webHidden/>
@@ -916,7 +916,7 @@
               <w:rPr>
                 <w:rStyle w:val="IndexLink"/>
               </w:rPr>
-              <w:t>整体任务可行性定理</w:t>
+              <w:t>整体任务执行条件与闭合检查</w:t>
             </w:r>
             <w:r>
               <w:rPr>
@@ -936,7 +936,7 @@
             </w:tabs>
             <w:rPr/>
           </w:pPr>
-          <w:hyperlink w:anchor="__RefHeading___Toc1845_851563711">
+          <w:hyperlink w:anchor="__RefHeading___Toc1834_4125612531">
             <w:r>
               <w:rPr>
                 <w:webHidden/>
@@ -955,7 +955,7 @@
                 <w:rStyle w:val="IndexLink"/>
               </w:rPr>
               <w:tab/>
-              <w:t>13</w:t>
+              <w:t>14</w:t>
             </w:r>
           </w:hyperlink>
         </w:p>
@@ -968,7 +968,7 @@
             </w:tabs>
             <w:rPr/>
           </w:pPr>
-          <w:hyperlink w:anchor="__RefHeading___Toc1847_851563711">
+          <w:hyperlink w:anchor="__RefHeading___Toc1836_4125612531">
             <w:r>
               <w:rPr>
                 <w:webHidden/>
@@ -987,7 +987,7 @@
                 <w:rStyle w:val="IndexLink"/>
               </w:rPr>
               <w:tab/>
-              <w:t>13</w:t>
+              <w:t>14</w:t>
             </w:r>
           </w:hyperlink>
         </w:p>
@@ -1000,7 +1000,7 @@
             </w:tabs>
             <w:rPr/>
           </w:pPr>
-          <w:hyperlink w:anchor="__RefHeading___Toc1849_851563711">
+          <w:hyperlink w:anchor="__RefHeading___Toc1838_4125612531">
             <w:r>
               <w:rPr>
                 <w:webHidden/>
@@ -1019,7 +1019,7 @@
                 <w:rStyle w:val="IndexLink"/>
               </w:rPr>
               <w:tab/>
-              <w:t>14</w:t>
+              <w:t>15</w:t>
             </w:r>
           </w:hyperlink>
         </w:p>
@@ -1032,7 +1032,7 @@
             </w:tabs>
             <w:rPr/>
           </w:pPr>
-          <w:hyperlink w:anchor="__RefHeading___Toc1851_851563711">
+          <w:hyperlink w:anchor="__RefHeading___Toc1840_4125612531">
             <w:r>
               <w:rPr>
                 <w:webHidden/>
@@ -1064,7 +1064,7 @@
             </w:tabs>
             <w:rPr/>
           </w:pPr>
-          <w:hyperlink w:anchor="__RefHeading___Toc1853_851563711">
+          <w:hyperlink w:anchor="__RefHeading___Toc1842_4125612531">
             <w:r>
               <w:rPr>
                 <w:webHidden/>
@@ -1083,7 +1083,7 @@
                 <w:rStyle w:val="IndexLink"/>
               </w:rPr>
               <w:tab/>
-              <w:t>15</w:t>
+              <w:t>16</w:t>
             </w:r>
           </w:hyperlink>
         </w:p>
@@ -1096,7 +1096,7 @@
             </w:tabs>
             <w:rPr/>
           </w:pPr>
-          <w:hyperlink w:anchor="__RefHeading___Toc1855_851563711">
+          <w:hyperlink w:anchor="__RefHeading___Toc1844_4125612531">
             <w:r>
               <w:rPr>
                 <w:webHidden/>
@@ -1115,7 +1115,7 @@
                 <w:rStyle w:val="IndexLink"/>
               </w:rPr>
               <w:tab/>
-              <w:t>15</w:t>
+              <w:t>16</w:t>
             </w:r>
           </w:hyperlink>
         </w:p>
@@ -1128,7 +1128,7 @@
             </w:tabs>
             <w:rPr/>
           </w:pPr>
-          <w:hyperlink w:anchor="__RefHeading___Toc1857_851563711">
+          <w:hyperlink w:anchor="__RefHeading___Toc1846_4125612531">
             <w:r>
               <w:rPr>
                 <w:webHidden/>
@@ -1147,7 +1147,7 @@
                 <w:rStyle w:val="IndexLink"/>
               </w:rPr>
               <w:tab/>
-              <w:t>16</w:t>
+              <w:t>17</w:t>
             </w:r>
           </w:hyperlink>
         </w:p>
@@ -1160,7 +1160,7 @@
             </w:tabs>
             <w:rPr/>
           </w:pPr>
-          <w:hyperlink w:anchor="__RefHeading___Toc1859_851563711">
+          <w:hyperlink w:anchor="__RefHeading___Toc1848_4125612531">
             <w:r>
               <w:rPr>
                 <w:webHidden/>
@@ -1179,7 +1179,7 @@
                 <w:rStyle w:val="IndexLink"/>
               </w:rPr>
               <w:tab/>
-              <w:t>17</w:t>
+              <w:t>18</w:t>
             </w:r>
           </w:hyperlink>
         </w:p>
@@ -1192,7 +1192,7 @@
             </w:tabs>
             <w:rPr/>
           </w:pPr>
-          <w:hyperlink w:anchor="__RefHeading___Toc1861_851563711">
+          <w:hyperlink w:anchor="__RefHeading___Toc1850_4125612531">
             <w:r>
               <w:rPr>
                 <w:webHidden/>
@@ -1205,7 +1205,7 @@
                 <w:rStyle w:val="IndexLink"/>
               </w:rPr>
               <w:tab/>
-              <w:t>18</w:t>
+              <w:t>19</w:t>
             </w:r>
           </w:hyperlink>
         </w:p>
@@ -1218,7 +1218,7 @@
             </w:tabs>
             <w:rPr/>
           </w:pPr>
-          <w:hyperlink w:anchor="__RefHeading___Toc1863_851563711">
+          <w:hyperlink w:anchor="__RefHeading___Toc1852_4125612531">
             <w:r>
               <w:rPr>
                 <w:webHidden/>
@@ -1243,7 +1243,7 @@
                 <w:rStyle w:val="IndexLink"/>
               </w:rPr>
               <w:tab/>
-              <w:t>20</w:t>
+              <w:t>22</w:t>
             </w:r>
           </w:hyperlink>
         </w:p>
@@ -1256,7 +1256,7 @@
             </w:tabs>
             <w:rPr/>
           </w:pPr>
-          <w:hyperlink w:anchor="__RefHeading___Toc1865_851563711">
+          <w:hyperlink w:anchor="__RefHeading___Toc1854_4125612531">
             <w:r>
               <w:rPr>
                 <w:webHidden/>
@@ -1281,7 +1281,7 @@
                 <w:rStyle w:val="IndexLink"/>
               </w:rPr>
               <w:tab/>
-              <w:t>21</w:t>
+              <w:t>23</w:t>
             </w:r>
           </w:hyperlink>
           <w:r>
@@ -1385,7 +1385,7 @@
             <w:rStyle w:val="IndexLink"/>
           </w:rPr>
           <w:tab/>
-          <w:t>2</w:t>
+          <w:t>3</w:t>
         </w:r>
       </w:hyperlink>
     </w:p>
@@ -1484,7 +1484,7 @@
             <w:rStyle w:val="IndexLink"/>
           </w:rPr>
           <w:tab/>
-          <w:t>15</w:t>
+          <w:t>16</w:t>
         </w:r>
       </w:hyperlink>
     </w:p>
@@ -1517,7 +1517,7 @@
             <w:rStyle w:val="IndexLink"/>
           </w:rPr>
           <w:tab/>
-          <w:t>16</w:t>
+          <w:t>17</w:t>
         </w:r>
       </w:hyperlink>
       <w:r>
@@ -1593,7 +1593,7 @@
             <w:rStyle w:val="IndexLink"/>
           </w:rPr>
           <w:tab/>
-          <w:t>2</w:t>
+          <w:t>3</w:t>
         </w:r>
       </w:hyperlink>
     </w:p>
@@ -1626,7 +1626,7 @@
             <w:rStyle w:val="IndexLink"/>
           </w:rPr>
           <w:tab/>
-          <w:t>4</w:t>
+          <w:t>5</w:t>
         </w:r>
       </w:hyperlink>
     </w:p>
@@ -1659,7 +1659,7 @@
             <w:rStyle w:val="IndexLink"/>
           </w:rPr>
           <w:tab/>
-          <w:t>6</w:t>
+          <w:t>7</w:t>
         </w:r>
       </w:hyperlink>
     </w:p>
@@ -1692,7 +1692,7 @@
             <w:rStyle w:val="IndexLink"/>
           </w:rPr>
           <w:tab/>
-          <w:t>14</w:t>
+          <w:t>15</w:t>
         </w:r>
       </w:hyperlink>
     </w:p>
@@ -1725,7 +1725,7 @@
             <w:rStyle w:val="IndexLink"/>
           </w:rPr>
           <w:tab/>
-          <w:t>16</w:t>
+          <w:t>17</w:t>
         </w:r>
       </w:hyperlink>
     </w:p>
@@ -1758,7 +1758,7 @@
             <w:rStyle w:val="IndexLink"/>
           </w:rPr>
           <w:tab/>
-          <w:t>16</w:t>
+          <w:t>17</w:t>
         </w:r>
       </w:hyperlink>
     </w:p>
@@ -1791,7 +1791,7 @@
             <w:rStyle w:val="IndexLink"/>
           </w:rPr>
           <w:tab/>
-          <w:t>20</w:t>
+          <w:t>22</w:t>
         </w:r>
       </w:hyperlink>
     </w:p>
@@ -1824,7 +1824,7 @@
             <w:rStyle w:val="IndexLink"/>
           </w:rPr>
           <w:tab/>
-          <w:t>21</w:t>
+          <w:t>23</w:t>
         </w:r>
       </w:hyperlink>
       <w:r>
@@ -1858,7 +1858,7 @@
         </w:numPr>
         <w:rPr/>
       </w:pPr>
-      <w:bookmarkStart w:id="0" w:name="__RefHeading___Toc1789_851563711"/>
+      <w:bookmarkStart w:id="0" w:name="__RefHeading___Toc1778_4125612531"/>
       <w:bookmarkStart w:id="1" w:name="引言"/>
       <w:bookmarkEnd w:id="0"/>
       <w:r>
@@ -1924,7 +1924,7 @@
         <w:rPr>
           <w:sz w:val="21"/>
         </w:rPr>
-        <w:t>）研究已经形成异构能力匹配、合作任务安排和在线修复等方法。</w:t>
+        <w:t>）需要共同考虑作业要求、成员能力、资源占用和任务之间的接续关系。</w:t>
       </w:r>
       <w:r>
         <w:rPr>
@@ -1960,7 +1960,55 @@
         <w:rPr>
           <w:sz w:val="21"/>
         </w:rPr>
-        <w:t>；</w:t>
+        <w:t>。</w:t>
+      </w:r>
+      <w:r>
+        <w:rPr>
+          <w:sz w:val="21"/>
+        </w:rPr>
+        <w:t>GRSTAPS</w:t>
+      </w:r>
+      <w:r>
+        <w:rPr>
+          <w:sz w:val="21"/>
+        </w:rPr>
+        <w:t>将任务规划、分配、调度和运动规划放入交错搜索</w:t>
+      </w:r>
+      <w:r>
+        <w:rPr>
+          <w:sz w:val="21"/>
+        </w:rPr>
+        <w:t>[2]</w:t>
+      </w:r>
+      <w:r>
+        <w:rPr>
+          <w:sz w:val="21"/>
+        </w:rPr>
+        <w:t>，</w:t>
+      </w:r>
+      <w:r>
+        <w:rPr>
+          <w:sz w:val="21"/>
+        </w:rPr>
+        <w:t>ITAGS</w:t>
+      </w:r>
+      <w:r>
+        <w:rPr>
+          <w:sz w:val="21"/>
+        </w:rPr>
+        <w:t>以能力需求和调度质量引导分配</w:t>
+      </w:r>
+      <w:r>
+        <w:rPr>
+          <w:sz w:val="21"/>
+        </w:rPr>
+        <w:t>[3]</w:t>
+      </w:r>
+      <w:r>
+        <w:rPr>
+          <w:sz w:val="21"/>
+        </w:rPr>
+        <w:t>，</w:t>
       </w:r>
       <w:r>
         <w:rPr>
@@ -1972,19 +2020,19 @@
         <w:rPr>
           <w:sz w:val="21"/>
         </w:rPr>
-        <w:t>将分配、调度和运动规划交错处理，并对受扰动部分进行定向修复</w:t>
-      </w:r>
-      <w:r>
-        <w:rPr>
-          <w:sz w:val="21"/>
-        </w:rPr>
-        <w:t>[2]</w:t>
-      </w:r>
-      <w:r>
-        <w:rPr>
-          <w:sz w:val="21"/>
-        </w:rPr>
-        <w:t>。这些工作说明，任务层决策需要维持与运动及执行状态的一致性，同时在线计算应结合任务规模和响应需求组织搜索。</w:t>
+        <w:t>进一步处理能力、任务需求和持续时间变化引起的定向修复</w:t>
+      </w:r>
+      <w:r>
+        <w:rPr>
+          <w:sz w:val="21"/>
+        </w:rPr>
+        <w:t>[4]</w:t>
+      </w:r>
+      <w:r>
+        <w:rPr>
+          <w:sz w:val="21"/>
+        </w:rPr>
+        <w:t>。这些研究构成任务与运动信息交换的基础，也说明计划内的耗时需要与实际执行反馈衔接。</w:t>
       </w:r>
     </w:p>
     <w:p>
@@ -1996,6 +2044,66 @@
         <w:rPr>
           <w:sz w:val="21"/>
         </w:rPr>
+        <w:t>时间不确定性会改变原分工的等待和支援关系。</w:t>
+      </w:r>
+      <w:r>
+        <w:rPr>
+          <w:sz w:val="21"/>
+        </w:rPr>
+        <w:t>HCSTU</w:t>
+      </w:r>
+      <w:r>
+        <w:rPr>
+          <w:sz w:val="21"/>
+        </w:rPr>
+        <w:t>以耗时场景采样和风险检验处理异构团队的时间不确定性</w:t>
+      </w:r>
+      <w:r>
+        <w:rPr>
+          <w:sz w:val="21"/>
+        </w:rPr>
+        <w:t>[5]</w:t>
+      </w:r>
+      <w:r>
+        <w:rPr>
+          <w:sz w:val="21"/>
+        </w:rPr>
+        <w:t>；</w:t>
+      </w:r>
+      <w:r>
+        <w:rPr>
+          <w:sz w:val="21"/>
+        </w:rPr>
+        <w:t>APEX-MR</w:t>
+      </w:r>
+      <w:r>
+        <w:rPr>
+          <w:sz w:val="21"/>
+        </w:rPr>
+        <w:t>在规划阶段构造任务和运动依赖，执行时依据前驱完成事件组织异步动作</w:t>
+      </w:r>
+      <w:r>
+        <w:rPr>
+          <w:sz w:val="21"/>
+        </w:rPr>
+        <w:t>[6]</w:t>
+      </w:r>
+      <w:r>
+        <w:rPr>
+          <w:sz w:val="21"/>
+        </w:rPr>
+        <w:t>。本研究使用任务量和声明运动配置构造名义估计，以实际动作终态和进度更新后续安排。上述不确定性处理作为研究对照，未以一次名义估计替代真实完成。</w:t>
+      </w:r>
+    </w:p>
+    <w:p>
+      <w:pPr>
+        <w:pStyle w:val="Normal"/>
+        <w:rPr/>
+      </w:pPr>
+      <w:r>
+        <w:rPr>
+          <w:sz w:val="21"/>
+        </w:rPr>
         <w:t>运动层方面，</w:t>
       </w:r>
       <w:r>
@@ -2014,7 +2122,31 @@
         <w:rPr>
           <w:sz w:val="21"/>
         </w:rPr>
-        <w:t>[3]</w:t>
+        <w:t>[7]</w:t>
+      </w:r>
+      <w:r>
+        <w:rPr>
+          <w:sz w:val="21"/>
+        </w:rPr>
+        <w:t>，</w:t>
+      </w:r>
+      <w:r>
+        <w:rPr>
+          <w:sz w:val="21"/>
+        </w:rPr>
+        <w:t>MINCO</w:t>
+      </w:r>
+      <w:r>
+        <w:rPr>
+          <w:sz w:val="21"/>
+        </w:rPr>
+        <w:t>研究为稀疏多项式轨迹表示和高效优化提供了方法基础</w:t>
+      </w:r>
+      <w:r>
+        <w:rPr>
+          <w:sz w:val="21"/>
+        </w:rPr>
+        <w:t>[8]</w:t>
       </w:r>
       <w:r>
         <w:rPr>
@@ -2062,49 +2194,253 @@
         <w:rPr>
           <w:sz w:val="21"/>
         </w:rPr>
-        <w:t>[4-5]</w:t>
-      </w:r>
-      <w:r>
-        <w:rPr>
-          <w:sz w:val="21"/>
-        </w:rPr>
-        <w:t>。结构巡视研究给出了规定距离下的轮廓、沿线及实时重规划思路</w:t>
-      </w:r>
-      <w:r>
-        <w:rPr>
-          <w:sz w:val="21"/>
-        </w:rPr>
-        <w:t>[6-7]</w:t>
-      </w:r>
-      <w:r>
-        <w:rPr>
-          <w:sz w:val="21"/>
-        </w:rPr>
-        <w:t>。移动支援与会合任务研究说明，作业和信息转交可以通过服务事件协调</w:t>
-      </w:r>
-      <w:r>
-        <w:rPr>
-          <w:sz w:val="21"/>
-        </w:rPr>
-        <w:t>[8]</w:t>
-      </w:r>
-      <w:r>
-        <w:rPr>
-          <w:sz w:val="21"/>
-        </w:rPr>
-        <w:t>；可停稳动作、已提交轨迹复核和备份轨迹研究为执行中更新运动提供了机制参考</w:t>
-      </w:r>
-      <w:r>
-        <w:rPr>
-          <w:sz w:val="21"/>
-        </w:rPr>
-        <w:t>[9-11]</w:t>
+        <w:t>[9,10]</w:t>
+      </w:r>
+      <w:r>
+        <w:rPr>
+          <w:sz w:val="21"/>
+        </w:rPr>
+        <w:t>，三维自适应</w:t>
+      </w:r>
+      <w:r>
+        <w:rPr>
+          <w:sz w:val="21"/>
+        </w:rPr>
+        <w:t>LOS</w:t>
+      </w:r>
+      <w:r>
+        <w:rPr>
+          <w:sz w:val="21"/>
+        </w:rPr>
+        <w:t>为跨深度路径跟随提供了进一步研究依据</w:t>
+      </w:r>
+      <w:r>
+        <w:rPr>
+          <w:sz w:val="21"/>
+        </w:rPr>
+        <w:t>[11]</w:t>
       </w:r>
       <w:r>
         <w:rPr>
           <w:sz w:val="21"/>
         </w:rPr>
         <w:t>。</w:t>
+      </w:r>
+      <w:r>
+        <w:rPr>
+          <w:sz w:val="21"/>
+        </w:rPr>
+        <w:t>TJ-FlyingFish</w:t>
+      </w:r>
+      <w:r>
+        <w:rPr>
+          <w:sz w:val="21"/>
+        </w:rPr>
+        <w:t>揭示了不同介质下推进配置和操纵能力的差异</w:t>
+      </w:r>
+      <w:r>
+        <w:rPr>
+          <w:sz w:val="21"/>
+        </w:rPr>
+        <w:t>[12]</w:t>
+      </w:r>
+      <w:r>
+        <w:rPr>
+          <w:sz w:val="21"/>
+        </w:rPr>
+        <w:t>，平滑跨介质轨迹规划研究则将模式动力学和转换过程纳入运动生成</w:t>
+      </w:r>
+      <w:r>
+        <w:rPr>
+          <w:sz w:val="21"/>
+        </w:rPr>
+        <w:t>[13]</w:t>
+      </w:r>
+      <w:r>
+        <w:rPr>
+          <w:sz w:val="21"/>
+        </w:rPr>
+        <w:t>。当前模型据此明确各平台实际支持的运动方式、转换入口和控制交接要求。</w:t>
+      </w:r>
+    </w:p>
+    <w:p>
+      <w:pPr>
+        <w:pStyle w:val="Normal"/>
+        <w:rPr/>
+      </w:pPr>
+      <w:r>
+        <w:rPr>
+          <w:sz w:val="21"/>
+        </w:rPr>
+        <w:t>面对未知环境，</w:t>
+      </w:r>
+      <w:r>
+        <w:rPr>
+          <w:sz w:val="21"/>
+        </w:rPr>
+        <w:t>FUEL</w:t>
+      </w:r>
+      <w:r>
+        <w:rPr>
+          <w:sz w:val="21"/>
+        </w:rPr>
+        <w:t>通过增量</w:t>
+      </w:r>
+      <w:r>
+        <w:rPr>
+          <w:sz w:val="21"/>
+        </w:rPr>
+        <w:t>frontier</w:t>
+      </w:r>
+      <w:r>
+        <w:rPr>
+          <w:sz w:val="21"/>
+        </w:rPr>
+        <w:t>信息组织探索与局部视点</w:t>
+      </w:r>
+      <w:r>
+        <w:rPr>
+          <w:sz w:val="21"/>
+        </w:rPr>
+        <w:t>[14]</w:t>
+      </w:r>
+      <w:r>
+        <w:rPr>
+          <w:sz w:val="21"/>
+        </w:rPr>
+        <w:t>，</w:t>
+      </w:r>
+      <w:r>
+        <w:rPr>
+          <w:sz w:val="21"/>
+        </w:rPr>
+        <w:t>FALCON</w:t>
+      </w:r>
+      <w:r>
+        <w:rPr>
+          <w:sz w:val="21"/>
+        </w:rPr>
+        <w:t>把覆盖引导和局部探索结合起来</w:t>
+      </w:r>
+      <w:r>
+        <w:rPr>
+          <w:sz w:val="21"/>
+        </w:rPr>
+        <w:t>[15]</w:t>
+      </w:r>
+      <w:r>
+        <w:rPr>
+          <w:sz w:val="21"/>
+        </w:rPr>
+        <w:t>，</w:t>
+      </w:r>
+      <w:r>
+        <w:rPr>
+          <w:sz w:val="21"/>
+        </w:rPr>
+        <w:t>OctoMap</w:t>
+      </w:r>
+      <w:r>
+        <w:rPr>
+          <w:sz w:val="21"/>
+        </w:rPr>
+        <w:t>给出了自由、占据及未知空间的三维地图表达</w:t>
+      </w:r>
+      <w:r>
+        <w:rPr>
+          <w:sz w:val="21"/>
+        </w:rPr>
+        <w:t>[16]</w:t>
+      </w:r>
+      <w:r>
+        <w:rPr>
+          <w:sz w:val="21"/>
+        </w:rPr>
+        <w:t>。本研究采用实测射线更新局部几何地图并选择可达短目标，借鉴这些地图和探索原则，未整套移植其探索系统。结构巡视研究提供了规定偏距下的轮廓、沿线及实时重规划思路</w:t>
+      </w:r>
+      <w:r>
+        <w:rPr>
+          <w:sz w:val="21"/>
+        </w:rPr>
+        <w:t>[17,18]</w:t>
+      </w:r>
+      <w:r>
+        <w:rPr>
+          <w:sz w:val="21"/>
+        </w:rPr>
+        <w:t>。区域扫描和设施巡视均需依据实际运动记录累计完成量，而不能仅凭到达航点确认完整作业。</w:t>
+      </w:r>
+    </w:p>
+    <w:p>
+      <w:pPr>
+        <w:pStyle w:val="Normal"/>
+        <w:rPr/>
+      </w:pPr>
+      <w:r>
+        <w:rPr>
+          <w:sz w:val="21"/>
+        </w:rPr>
+        <w:t>移动支援与会合任务研究表明，作业和信息转交可以通过服务事件协调</w:t>
+      </w:r>
+      <w:r>
+        <w:rPr>
+          <w:sz w:val="21"/>
+        </w:rPr>
+        <w:t>[19]</w:t>
+      </w:r>
+      <w:r>
+        <w:rPr>
+          <w:sz w:val="21"/>
+        </w:rPr>
+        <w:t>。</w:t>
+      </w:r>
+      <w:r>
+        <w:rPr>
+          <w:sz w:val="21"/>
+        </w:rPr>
+        <w:t>CoCoPlan</w:t>
+      </w:r>
+      <w:r>
+        <w:rPr>
+          <w:sz w:val="21"/>
+        </w:rPr>
+        <w:t>进一步共同安排协作任务与间歇通信事件</w:t>
+      </w:r>
+      <w:r>
+        <w:rPr>
+          <w:sz w:val="21"/>
+        </w:rPr>
+        <w:t>[20]</w:t>
+      </w:r>
+      <w:r>
+        <w:rPr>
+          <w:sz w:val="21"/>
+        </w:rPr>
+        <w:t>，为支援位置、信息需求和任务接续之间的关系提供了研究依据。可停稳动作、已提交轨迹复核和备份轨迹研究为执行中更新运动提供了机制参考</w:t>
+      </w:r>
+      <w:r>
+        <w:rPr>
+          <w:sz w:val="21"/>
+        </w:rPr>
+        <w:t>[21,22,23]</w:t>
+      </w:r>
+      <w:r>
+        <w:rPr>
+          <w:sz w:val="21"/>
+        </w:rPr>
+        <w:t>。本报告的仿真记录采用任务级支援和</w:t>
+      </w:r>
+      <w:r>
+        <w:rPr>
+          <w:sz w:val="21"/>
+        </w:rPr>
+        <w:t>ROS</w:t>
+      </w:r>
+      <w:r>
+        <w:rPr>
+          <w:sz w:val="21"/>
+        </w:rPr>
+        <w:t>收件模型，相关文献用于说明交付与运动耦合的研究背景及方法来源。</w:t>
       </w:r>
     </w:p>
     <w:p>
@@ -2248,7 +2584,7 @@
         </w:numPr>
         <w:rPr/>
       </w:pPr>
-      <w:bookmarkStart w:id="2" w:name="__RefHeading___Toc1791_851563711"/>
+      <w:bookmarkStart w:id="2" w:name="__RefHeading___Toc1780_4125612531"/>
       <w:bookmarkStart w:id="3" w:name="异构跨域协同任务统一建模"/>
       <w:bookmarkEnd w:id="2"/>
       <w:r>
@@ -2270,7 +2606,7 @@
         </w:numPr>
         <w:rPr/>
       </w:pPr>
-      <w:bookmarkStart w:id="4" w:name="__RefHeading___Toc1793_851563711"/>
+      <w:bookmarkStart w:id="4" w:name="__RefHeading___Toc1782_4125612531"/>
       <w:bookmarkStart w:id="5" w:name="系统组成与任务输入输出"/>
       <w:bookmarkEnd w:id="4"/>
       <w:r>
@@ -2990,7 +3326,7 @@
         </w:numPr>
         <w:rPr/>
       </w:pPr>
-      <w:bookmarkStart w:id="6" w:name="__RefHeading___Toc1795_851563711"/>
+      <w:bookmarkStart w:id="6" w:name="__RefHeading___Toc1784_4125612531"/>
       <w:bookmarkStart w:id="7" w:name="物理成员与执行单元"/>
       <w:bookmarkEnd w:id="6"/>
       <w:r>
@@ -3552,7 +3888,7 @@
         </w:numPr>
         <w:rPr/>
       </w:pPr>
-      <w:bookmarkStart w:id="8" w:name="__RefHeading___Toc1797_851563711"/>
+      <w:bookmarkStart w:id="8" w:name="__RefHeading___Toc1786_4125612531"/>
       <w:bookmarkStart w:id="9" w:name="模式相关动力学与跨域转换"/>
       <w:bookmarkEnd w:id="8"/>
       <w:r>
@@ -4263,7 +4599,7 @@
         <w:rPr>
           <w:sz w:val="21"/>
         </w:rPr>
-        <w:t>[4]</w:t>
+        <w:t>[9]</w:t>
       </w:r>
     </w:p>
     <w:tbl>
@@ -5013,7 +5349,7 @@
         </w:numPr>
         <w:rPr/>
       </w:pPr>
-      <w:bookmarkStart w:id="10" w:name="__RefHeading___Toc1799_851563711"/>
+      <w:bookmarkStart w:id="10" w:name="__RefHeading___Toc1788_4125612531"/>
       <w:bookmarkStart w:id="11" w:name="能力与作业意图"/>
       <w:bookmarkEnd w:id="10"/>
       <w:r>
@@ -6337,7 +6673,7 @@
         </w:numPr>
         <w:rPr/>
       </w:pPr>
-      <w:bookmarkStart w:id="12" w:name="__RefHeading___Toc1801_851563711"/>
+      <w:bookmarkStart w:id="12" w:name="__RefHeading___Toc1790_4125612531"/>
       <w:bookmarkStart w:id="13" w:name="分配资源与时序"/>
       <w:bookmarkEnd w:id="12"/>
       <w:r>
@@ -7322,7 +7658,7 @@
         </w:numPr>
         <w:rPr/>
       </w:pPr>
-      <w:bookmarkStart w:id="14" w:name="__RefHeading___Toc1803_851563711"/>
+      <w:bookmarkStart w:id="14" w:name="__RefHeading___Toc1792_4125612531"/>
       <w:bookmarkStart w:id="15" w:name="共享支援与信息事件"/>
       <w:bookmarkEnd w:id="14"/>
       <w:r>
@@ -8001,7 +8337,7 @@
         <w:rPr>
           <w:sz w:val="21"/>
         </w:rPr>
-        <w:t>[8]</w:t>
+        <w:t>[19]</w:t>
       </w:r>
       <w:r>
         <w:rPr>
@@ -8821,7 +9157,7 @@
         </w:numPr>
         <w:rPr/>
       </w:pPr>
-      <w:bookmarkStart w:id="16" w:name="__RefHeading___Toc1805_851563711"/>
+      <w:bookmarkStart w:id="16" w:name="__RefHeading___Toc1794_4125612531"/>
       <w:bookmarkStart w:id="17" w:name="快速联合任务分配与资源调度方法"/>
       <w:bookmarkEnd w:id="16"/>
       <w:r>
@@ -8843,7 +9179,7 @@
         </w:numPr>
         <w:rPr/>
       </w:pPr>
-      <w:bookmarkStart w:id="18" w:name="__RefHeading___Toc1807_851563711"/>
+      <w:bookmarkStart w:id="18" w:name="__RefHeading___Toc1796_4125612531"/>
       <w:bookmarkStart w:id="19" w:name="联合变量与评价方式"/>
       <w:bookmarkEnd w:id="18"/>
       <w:r>
@@ -9821,7 +10157,7 @@
         <w:rPr>
           <w:sz w:val="21"/>
         </w:rPr>
-        <w:t>[2]</w:t>
+        <w:t>[4]</w:t>
       </w:r>
       <w:r>
         <w:rPr>
@@ -9839,7 +10175,7 @@
         </w:numPr>
         <w:rPr/>
       </w:pPr>
-      <w:bookmarkStart w:id="20" w:name="__RefHeading___Toc1809_851563711"/>
+      <w:bookmarkStart w:id="20" w:name="__RefHeading___Toc1798_4125612531"/>
       <w:bookmarkStart w:id="21" w:name="完整候选构造"/>
       <w:bookmarkEnd w:id="20"/>
       <w:r>
@@ -10687,7 +11023,7 @@
         </w:numPr>
         <w:rPr/>
       </w:pPr>
-      <w:bookmarkStart w:id="22" w:name="__RefHeading___Toc1811_851563711"/>
+      <w:bookmarkStart w:id="22" w:name="__RefHeading___Toc1800_4125612531"/>
       <w:bookmarkStart w:id="23" w:name="时序递推与事件放行"/>
       <w:bookmarkEnd w:id="22"/>
       <w:r>
@@ -11463,7 +11799,19 @@
         <w:rPr>
           <w:sz w:val="21"/>
         </w:rPr>
-        <w:t>前驱需实际完成、成员可接管、方法入口及必要信息就绪。只有存在依赖的活动等待；预计时序用于初始安排，实际事件推进后继。</w:t>
+        <w:t>前驱需实际完成、成员可接管、方法入口及必要信息就绪。只有存在依赖的活动等待；预计时序用于初始安排，实际事件推进后继。异步执行的相关研究也采用任务和运动前置事件组织后继动作</w:t>
+      </w:r>
+      <w:r>
+        <w:rPr>
+          <w:sz w:val="21"/>
+        </w:rPr>
+        <w:t>[6]</w:t>
+      </w:r>
+      <w:r>
+        <w:rPr>
+          <w:sz w:val="21"/>
+        </w:rPr>
+        <w:t>。</w:t>
       </w:r>
     </w:p>
     <w:p>
@@ -11473,30 +11821,9 @@
       </w:pPr>
       <w:r>
         <w:rPr>
-          <w:b/>
-          <w:sz w:val="21"/>
-        </w:rPr>
-        <w:t>命题</w:t>
-      </w:r>
-      <w:r>
-        <w:rPr>
-          <w:b/>
-          <w:sz w:val="21"/>
-        </w:rPr>
-        <w:t>1</w:t>
-      </w:r>
-      <w:r>
-        <w:rPr>
-          <w:b/>
-          <w:sz w:val="21"/>
-        </w:rPr>
-        <w:t>：固定候选时序可构造性。</w:t>
-      </w:r>
-      <w:r>
-        <w:rPr>
-          <w:sz w:val="21"/>
-        </w:rPr>
-        <w:t xml:space="preserve"> 若活动图无环，持续时间有限，同成员冲突由接续边消除，服务条件和声明时间窗通过检查，则式（</w:t>
+          <w:sz w:val="21"/>
+        </w:rPr>
+        <w:t>在无环活动图中，规划器按拓扑顺序计算式（</w:t>
       </w:r>
       <w:r>
         <w:rPr>
@@ -11508,26 +11835,7 @@
         <w:rPr>
           <w:sz w:val="21"/>
         </w:rPr>
-        <w:t>）构造满足该候选的名义时序。</w:t>
-      </w:r>
-    </w:p>
-    <w:p>
-      <w:pPr>
-        <w:pStyle w:val="Normal"/>
-        <w:rPr/>
-      </w:pPr>
-      <w:r>
-        <w:rPr>
-          <w:b/>
-          <w:sz w:val="21"/>
-        </w:rPr>
-        <w:t>证明：</w:t>
-      </w:r>
-      <w:r>
-        <w:rPr>
-          <w:sz w:val="21"/>
-        </w:rPr>
-        <w:t xml:space="preserve"> 拓扑排序使前驱先于后继计算。开始时刻取前驱完成和最早可用时刻的最大值，故每条依赖满足；同成员按边接续，故不重叠。有限节点和有限持续时间使递推结束，服务及时间窗由完整检查保障。</w:t>
+        <w:t>），使前驱先于后继进入时间递推。同一成员的作业建立接续关系，后项的名义开始时刻不早于前项的名义结束时刻；不同成员没有必要依赖时可以并行。服务区间及用户声明时间窗还需按其要求核对。执行阶段继续保持资源占用，直到匹配动作的实际终态得到核实，因此名义时刻的偏差不会自动释放成员。</w:t>
       </w:r>
     </w:p>
     <w:p>
@@ -11539,7 +11847,7 @@
         </w:numPr>
         <w:rPr/>
       </w:pPr>
-      <w:bookmarkStart w:id="24" w:name="__RefHeading___Toc1813_851563711"/>
+      <w:bookmarkStart w:id="24" w:name="__RefHeading___Toc1802_4125612531"/>
       <w:bookmarkStart w:id="25" w:name="剩余作业修复"/>
       <w:bookmarkEnd w:id="24"/>
       <w:r>
@@ -12016,7 +12324,43 @@
         <w:rPr>
           <w:sz w:val="21"/>
         </w:rPr>
-        <w:t>修复保留有效完成量，调整相关未开始活动及其后继。局部障碍由当前执行端调整短运动；不能继续、设施变化、服务失效或明确复查进入任务层。交接确认实际终态后，用真实状态接续。</w:t>
+        <w:t>修复保留有效完成量，调整相关未开始活动及其后继。局部障碍由当前执行端调整短运动；不能继续、设施变化、服务失效或明确复查进入任务层。交接确认实际终态后，用真实状态接续。相关方法分别参考动态任务修复</w:t>
+      </w:r>
+      <w:r>
+        <w:rPr>
+          <w:sz w:val="21"/>
+        </w:rPr>
+        <w:t>[1,4]</w:t>
+      </w:r>
+      <w:r>
+        <w:rPr>
+          <w:sz w:val="21"/>
+        </w:rPr>
+        <w:t>与事件驱动的异步执行</w:t>
+      </w:r>
+      <w:r>
+        <w:rPr>
+          <w:sz w:val="21"/>
+        </w:rPr>
+        <w:t>[6]</w:t>
+      </w:r>
+      <w:r>
+        <w:rPr>
+          <w:sz w:val="21"/>
+        </w:rPr>
+        <w:t>；当时间不确定性参与方案比较时，还需获得相应耗时样本或区间信息</w:t>
+      </w:r>
+      <w:r>
+        <w:rPr>
+          <w:sz w:val="21"/>
+        </w:rPr>
+        <w:t>[5]</w:t>
+      </w:r>
+      <w:r>
+        <w:rPr>
+          <w:sz w:val="21"/>
+        </w:rPr>
+        <w:t>。</w:t>
       </w:r>
     </w:p>
     <w:p>
@@ -12064,7 +12408,7 @@
         </w:numPr>
         <w:rPr/>
       </w:pPr>
-      <w:bookmarkStart w:id="26" w:name="__RefHeading___Toc1815_851563711"/>
+      <w:bookmarkStart w:id="26" w:name="__RefHeading___Toc1804_4125612531"/>
       <w:bookmarkStart w:id="27" w:name="计算组织"/>
       <w:bookmarkEnd w:id="26"/>
       <w:r>
@@ -12215,7 +12559,7 @@
         </w:numPr>
         <w:rPr/>
       </w:pPr>
-      <w:bookmarkStart w:id="28" w:name="__RefHeading___Toc1817_851563711"/>
+      <w:bookmarkStart w:id="28" w:name="__RefHeading___Toc1806_4125612531"/>
       <w:bookmarkStart w:id="29" w:name="自主路径规划与跨域协同控制方法"/>
       <w:bookmarkEnd w:id="28"/>
       <w:r>
@@ -12237,7 +12581,7 @@
         </w:numPr>
         <w:rPr/>
       </w:pPr>
-      <w:bookmarkStart w:id="30" w:name="__RefHeading___Toc1819_851563711"/>
+      <w:bookmarkStart w:id="30" w:name="__RefHeading___Toc1808_4125612531"/>
       <w:bookmarkStart w:id="31" w:name="作业几何生成"/>
       <w:bookmarkEnd w:id="30"/>
       <w:r>
@@ -12658,7 +13002,7 @@
         <w:rPr>
           <w:sz w:val="21"/>
         </w:rPr>
-        <w:t>[6-7]</w:t>
+        <w:t>[17,18]</w:t>
       </w:r>
       <w:r>
         <w:rPr>
@@ -12804,7 +13148,7 @@
         </w:numPr>
         <w:rPr/>
       </w:pPr>
-      <w:bookmarkStart w:id="32" w:name="__RefHeading___Toc1821_851563711"/>
+      <w:bookmarkStart w:id="32" w:name="__RefHeading___Toc1810_4125612531"/>
       <w:bookmarkStart w:id="33" w:name="感知地图与局部路径选择"/>
       <w:bookmarkEnd w:id="32"/>
       <w:r>
@@ -13867,7 +14211,7 @@
         </w:numPr>
         <w:rPr/>
       </w:pPr>
-      <w:bookmarkStart w:id="34" w:name="__RefHeading___Toc1823_851563711"/>
+      <w:bookmarkStart w:id="34" w:name="__RefHeading___Toc1812_4125612531"/>
       <w:bookmarkStart w:id="35" w:name="air轨迹优化与编队"/>
       <w:bookmarkEnd w:id="34"/>
       <w:r>
@@ -13925,7 +14269,7 @@
         <w:rPr>
           <w:sz w:val="21"/>
         </w:rPr>
-        <w:t>[3]</w:t>
+        <w:t>[7]</w:t>
       </w:r>
       <w:r>
         <w:rPr>
@@ -15630,7 +15974,7 @@
         </w:numPr>
         <w:rPr/>
       </w:pPr>
-      <w:bookmarkStart w:id="36" w:name="__RefHeading___Toc1825_851563711"/>
+      <w:bookmarkStart w:id="36" w:name="__RefHeading___Toc1814_4125612531"/>
       <w:bookmarkStart w:id="37" w:name="water前进式引导"/>
       <w:bookmarkEnd w:id="36"/>
       <w:r>
@@ -16469,7 +16813,7 @@
         <w:rPr>
           <w:sz w:val="21"/>
         </w:rPr>
-        <w:t>[5]</w:t>
+        <w:t>[10]</w:t>
       </w:r>
       <w:r>
         <w:rPr>
@@ -16945,7 +17289,7 @@
         </w:numPr>
         <w:rPr/>
       </w:pPr>
-      <w:bookmarkStart w:id="38" w:name="__RefHeading___Toc1827_851563711"/>
+      <w:bookmarkStart w:id="38" w:name="__RefHeading___Toc1816_4125612531"/>
       <w:bookmarkStart w:id="39" w:name="usv短运动与停稳续段"/>
       <w:bookmarkEnd w:id="38"/>
       <w:r>
@@ -17334,7 +17678,7 @@
         <w:rPr>
           <w:sz w:val="21"/>
         </w:rPr>
-        <w:t>[9]</w:t>
+        <w:t>[21]</w:t>
       </w:r>
       <w:r>
         <w:rPr>
@@ -17382,7 +17726,7 @@
         <w:rPr>
           <w:sz w:val="21"/>
         </w:rPr>
-        <w:t>[4]</w:t>
+        <w:t>[9]</w:t>
       </w:r>
       <w:r>
         <w:rPr>
@@ -17412,7 +17756,7 @@
         </w:numPr>
         <w:rPr/>
       </w:pPr>
-      <w:bookmarkStart w:id="40" w:name="__RefHeading___Toc1829_851563711"/>
+      <w:bookmarkStart w:id="40" w:name="__RefHeading___Toc1818_4125612531"/>
       <w:bookmarkStart w:id="41" w:name="参考交接与动态避碰"/>
       <w:bookmarkEnd w:id="40"/>
       <w:r>
@@ -17802,7 +18146,7 @@
         <w:rPr>
           <w:sz w:val="21"/>
         </w:rPr>
-        <w:t>[10]</w:t>
+        <w:t>[22]</w:t>
       </w:r>
       <w:r>
         <w:rPr>
@@ -18518,7 +18862,7 @@
         <w:rPr>
           <w:sz w:val="21"/>
         </w:rPr>
-        <w:t>[11]</w:t>
+        <w:t>[23]</w:t>
       </w:r>
       <w:r>
         <w:rPr>
@@ -18536,7 +18880,7 @@
         </w:numPr>
         <w:rPr/>
       </w:pPr>
-      <w:bookmarkStart w:id="42" w:name="__RefHeading___Toc1831_851563711"/>
+      <w:bookmarkStart w:id="42" w:name="__RefHeading___Toc1820_4125612531"/>
       <w:bookmarkStart w:id="43" w:name="合格进度与报告"/>
       <w:bookmarkEnd w:id="42"/>
       <w:r>
@@ -19578,8 +19922,8 @@
         </w:numPr>
         <w:rPr/>
       </w:pPr>
-      <w:bookmarkStart w:id="44" w:name="__RefHeading___Toc1833_851563711"/>
-      <w:bookmarkStart w:id="45" w:name="协同任务闭环的整体可行性分析"/>
+      <w:bookmarkStart w:id="44" w:name="__RefHeading___Toc1822_4125612531"/>
+      <w:bookmarkStart w:id="45" w:name="协同执行条件与任务完成分析"/>
       <w:bookmarkEnd w:id="44"/>
       <w:r>
         <w:rPr/>
@@ -19587,7 +19931,7 @@
       </w:r>
       <w:r>
         <w:rPr/>
-        <w:t>协同任务闭环的整体可行性分析</w:t>
+        <w:t>协同执行条件与任务完成分析</w:t>
       </w:r>
       <w:bookmarkEnd w:id="45"/>
     </w:p>
@@ -19600,7 +19944,7 @@
         </w:numPr>
         <w:rPr/>
       </w:pPr>
-      <w:bookmarkStart w:id="46" w:name="__RefHeading___Toc1835_851563711"/>
+      <w:bookmarkStart w:id="46" w:name="__RefHeading___Toc1824_4125612531"/>
       <w:bookmarkStart w:id="47" w:name="模式内误差界与交接"/>
       <w:bookmarkEnd w:id="46"/>
       <w:r>
@@ -21619,8 +21963,8 @@
         </w:numPr>
         <w:rPr/>
       </w:pPr>
-      <w:bookmarkStart w:id="48" w:name="__RefHeading___Toc1837_851563711"/>
-      <w:bookmarkStart w:id="49" w:name="从跟踪推导巡视有限完成"/>
+      <w:bookmarkStart w:id="48" w:name="__RefHeading___Toc1826_4125612531"/>
+      <w:bookmarkStart w:id="49" w:name="巡视进度与作业时长分析"/>
       <w:bookmarkEnd w:id="48"/>
       <w:r>
         <w:rPr/>
@@ -21628,7 +21972,7 @@
       </w:r>
       <w:r>
         <w:rPr/>
-        <w:t>从跟踪推导巡视有限完成</w:t>
+        <w:t>巡视进度与作业时长分析</w:t>
       </w:r>
       <w:bookmarkEnd w:id="49"/>
     </w:p>
@@ -23216,8 +23560,8 @@
         </w:numPr>
         <w:rPr/>
       </w:pPr>
-      <w:bookmarkStart w:id="50" w:name="__RefHeading___Toc1839_851563711"/>
-      <w:bookmarkStart w:id="51" w:name="资源与计量不变量"/>
+      <w:bookmarkStart w:id="50" w:name="__RefHeading___Toc1828_4125612531"/>
+      <w:bookmarkStart w:id="51" w:name="资源占用与完成量计算"/>
       <w:bookmarkEnd w:id="50"/>
       <w:r>
         <w:rPr/>
@@ -23225,7 +23569,7 @@
       </w:r>
       <w:r>
         <w:rPr/>
-        <w:t>资源与计量不变量</w:t>
+        <w:t>资源占用与完成量计算</w:t>
       </w:r>
       <w:bookmarkEnd w:id="51"/>
     </w:p>
@@ -23236,30 +23580,9 @@
       </w:pPr>
       <w:r>
         <w:rPr>
-          <w:b/>
-          <w:sz w:val="21"/>
-        </w:rPr>
-        <w:t>命题</w:t>
-      </w:r>
-      <w:r>
-        <w:rPr>
-          <w:b/>
-          <w:sz w:val="21"/>
-        </w:rPr>
-        <w:t>2</w:t>
-      </w:r>
-      <w:r>
-        <w:rPr>
-          <w:b/>
-          <w:sz w:val="21"/>
-        </w:rPr>
-        <w:t>：物理资源互斥。</w:t>
-      </w:r>
-      <w:r>
-        <w:rPr>
-          <w:sz w:val="21"/>
-        </w:rPr>
-        <w:t xml:space="preserve"> 新活动仅在参与成员空闲时接纳，运行和未知终态保持占用，释放要求当前</w:t>
+          <w:sz w:val="21"/>
+        </w:rPr>
+        <w:t>资源管理以物理成员为索引。新活动接纳前检查参与成员是否空闲；活动运行或终态未知时保持其占用；释放时核对当前</w:t>
       </w:r>
       <w:r>
         <w:rPr>
@@ -23271,7 +23594,19 @@
         <w:rPr>
           <w:sz w:val="21"/>
         </w:rPr>
-        <w:t>匹配且终态核实，则任何成员至多属于一个有效活动。</w:t>
+        <w:t>与实际终态。该过程落实式（</w:t>
+      </w:r>
+      <w:r>
+        <w:rPr>
+          <w:sz w:val="21"/>
+        </w:rPr>
+        <w:t>8</w:t>
+      </w:r>
+      <w:r>
+        <w:rPr>
+          <w:sz w:val="21"/>
+        </w:rPr>
+        <w:t>）的单成员互斥要求，使单机、编队和跨介质执行入口共享同一资源。超出预计结束时刻仅表示计划出现偏差，不能据此释放仍在作业的成员。</w:t>
       </w:r>
     </w:p>
     <w:p>
@@ -23281,118 +23616,9 @@
       </w:pPr>
       <w:r>
         <w:rPr>
-          <w:b/>
-          <w:sz w:val="21"/>
-        </w:rPr>
-        <w:t>证明：</w:t>
-      </w:r>
-      <w:r>
-        <w:rPr>
-          <w:sz w:val="21"/>
-        </w:rPr>
-        <w:t xml:space="preserve"> 初始满足式（</w:t>
-      </w:r>
-      <w:r>
-        <w:rPr>
-          <w:sz w:val="21"/>
-        </w:rPr>
-        <w:t>8</w:t>
-      </w:r>
-      <w:r>
-        <w:rPr>
-          <w:sz w:val="21"/>
-        </w:rPr>
-        <w:t>），接纳前的空闲检查避免重复占用，运行不改变所有权，释放仅移除对应占用。按事件序列归纳，互斥始终成立。</w:t>
-      </w:r>
-    </w:p>
-    <w:p>
-      <w:pPr>
-        <w:pStyle w:val="Normal"/>
-        <w:rPr/>
-      </w:pPr>
-      <w:r>
-        <w:rPr>
-          <w:b/>
-          <w:sz w:val="21"/>
-        </w:rPr>
-        <w:t>命题</w:t>
-      </w:r>
-      <w:r>
-        <w:rPr>
-          <w:b/>
-          <w:sz w:val="21"/>
-        </w:rPr>
-        <w:t>3</w:t>
-      </w:r>
-      <w:r>
-        <w:rPr>
-          <w:b/>
-          <w:sz w:val="21"/>
-        </w:rPr>
-        <w:t>：进度单调与去重。</w:t>
-      </w:r>
-      <w:r>
-        <w:rPr>
-          <w:sz w:val="21"/>
-        </w:rPr>
-        <w:t xml:space="preserve"> 对同一有效空间作业版本，累计集合单调、比例在 </w:t>
-      </w:r>
-      <w:r>
-        <w:rPr/>
-      </w:r>
-      <m:oMath xmlns:m="http://schemas.openxmlformats.org/officeDocument/2006/math">
-        <m:r>
-          <m:rPr>
-            <m:lit/>
-            <m:nor/>
-          </m:rPr>
-          <m:t xml:space="preserve">[</m:t>
-        </m:r>
-        <m:r>
-          <m:t xml:space="preserve">0</m:t>
-        </m:r>
-        <m:r>
-          <m:rPr>
-            <m:lit/>
-            <m:nor/>
-          </m:rPr>
-          <m:t xml:space="preserve">,</m:t>
-        </m:r>
-        <m:r>
-          <m:t xml:space="preserve">1</m:t>
-        </m:r>
-        <m:r>
-          <m:rPr>
-            <m:lit/>
-            <m:nor/>
-          </m:rPr>
-          <m:t xml:space="preserve">]</m:t>
-        </m:r>
-      </m:oMath>
-      <w:r>
-        <w:rPr>
-          <w:sz w:val="21"/>
-        </w:rPr>
-        <w:t xml:space="preserve"> 内，重复经过已合格区间不增量。</w:t>
-      </w:r>
-    </w:p>
-    <w:p>
-      <w:pPr>
-        <w:pStyle w:val="Normal"/>
-        <w:rPr/>
-      </w:pPr>
-      <w:r>
-        <w:rPr>
-          <w:b/>
-          <w:sz w:val="21"/>
-        </w:rPr>
-        <w:t>证明：</w:t>
-      </w:r>
-      <w:r>
-        <w:rPr>
-          <w:sz w:val="21"/>
-        </w:rPr>
-        <w:t xml:space="preserve"> </w:t>
+          <w:sz w:val="21"/>
+        </w:rPr>
+        <w:t>同一有效空间作业版本采用区间并集累计：</w:t>
       </w:r>
       <w:r>
         <w:rPr/>
@@ -23493,7 +23719,7 @@
         <w:rPr>
           <w:sz w:val="21"/>
         </w:rPr>
-        <w:t xml:space="preserve">，故 </w:t>
+        <w:t xml:space="preserve">，并保持 </w:t>
       </w:r>
       <w:r>
         <w:rPr/>
@@ -23574,7 +23800,57 @@
         <w:rPr>
           <w:sz w:val="21"/>
         </w:rPr>
-        <w:t>。已包含区间不改变并集。版本作为集合索引，当前有效修复保留原集合，改变定义后建立新集合。</w:t>
+        <w:t xml:space="preserve">。已包含的合格区间不改变并集，完成比例保持在 </w:t>
+      </w:r>
+      <w:r>
+        <w:rPr/>
+      </w:r>
+      <m:oMath xmlns:m="http://schemas.openxmlformats.org/officeDocument/2006/math">
+        <m:r>
+          <m:rPr>
+            <m:lit/>
+            <m:nor/>
+          </m:rPr>
+          <m:t xml:space="preserve">[</m:t>
+        </m:r>
+        <m:r>
+          <m:t xml:space="preserve">0</m:t>
+        </m:r>
+        <m:r>
+          <m:rPr>
+            <m:lit/>
+            <m:nor/>
+          </m:rPr>
+          <m:t xml:space="preserve">,</m:t>
+        </m:r>
+        <m:r>
+          <m:t xml:space="preserve">1</m:t>
+        </m:r>
+        <m:r>
+          <m:rPr>
+            <m:lit/>
+            <m:nor/>
+          </m:rPr>
+          <m:t xml:space="preserve">]</m:t>
+        </m:r>
+      </m:oMath>
+      <w:r>
+        <w:rPr>
+          <w:sz w:val="21"/>
+        </w:rPr>
+        <w:t>。版本作为集合索引，同请求修复可以保留仍然有效的完成量，作业定义改变后重新建立相应集合。连续驻留计时另按式（</w:t>
+      </w:r>
+      <w:r>
+        <w:rPr>
+          <w:sz w:val="21"/>
+        </w:rPr>
+        <w:t>33</w:t>
+      </w:r>
+      <w:r>
+        <w:rPr>
+          <w:sz w:val="21"/>
+        </w:rPr>
+        <w:t>）判断，中断后重新累计，不用多个不连续时间段拼成一次合格驻留。</w:t>
       </w:r>
     </w:p>
     <w:p>
@@ -23586,7 +23862,7 @@
         </w:numPr>
         <w:rPr/>
       </w:pPr>
-      <w:bookmarkStart w:id="52" w:name="__RefHeading___Toc1841_851563711"/>
+      <w:bookmarkStart w:id="52" w:name="__RefHeading___Toc1830_4125612531"/>
       <w:bookmarkStart w:id="53" w:name="报告因果与作业闭合"/>
       <w:bookmarkEnd w:id="52"/>
       <w:r>
@@ -23927,30 +24203,9 @@
       </w:pPr>
       <w:r>
         <w:rPr>
-          <w:b/>
-          <w:sz w:val="21"/>
-        </w:rPr>
-        <w:t>命题</w:t>
-      </w:r>
-      <w:r>
-        <w:rPr>
-          <w:b/>
-          <w:sz w:val="21"/>
-        </w:rPr>
-        <w:t>4</w:t>
-      </w:r>
-      <w:r>
-        <w:rPr>
-          <w:b/>
-          <w:sz w:val="21"/>
-        </w:rPr>
-        <w:t>：匹配报告的因果一致性。</w:t>
-      </w:r>
-      <w:r>
-        <w:rPr>
-          <w:sz w:val="21"/>
-        </w:rPr>
-        <w:t xml:space="preserve"> 报告在作业合格后产生，接收核对请求、版本和</w:t>
+          <w:sz w:val="21"/>
+        </w:rPr>
+        <w:t>报告在规定作业合格后产生，收件时核对请求、作业版本和</w:t>
       </w:r>
       <w:r>
         <w:rPr>
@@ -23962,26 +24217,7 @@
         <w:rPr>
           <w:sz w:val="21"/>
         </w:rPr>
-        <w:t>，释放核对当前占用，则收件和释放只作用于相应执行。</w:t>
-      </w:r>
-    </w:p>
-    <w:p>
-      <w:pPr>
-        <w:pStyle w:val="Normal"/>
-        <w:rPr/>
-      </w:pPr>
-      <w:r>
-        <w:rPr>
-          <w:b/>
-          <w:sz w:val="21"/>
-        </w:rPr>
-        <w:t>证明：</w:t>
-      </w:r>
-      <w:r>
-        <w:rPr>
-          <w:sz w:val="21"/>
-        </w:rPr>
-        <w:t xml:space="preserve"> 报告键唯一，接收只更新该键；版本或</w:t>
+        <w:t>，仅更新相应执行记录。资源释放还需要当前占用者匹配和真实终态核实。历史报告可归档，但不能移除新</w:t>
       </w:r>
       <w:r>
         <w:rPr>
@@ -23993,7 +24229,7 @@
         <w:rPr>
           <w:sz w:val="21"/>
         </w:rPr>
-        <w:t>不同不能改变当前状态。释放包含占用者匹配和核实条件，历史报告不能移除新占用。产生规则保证收件不早于作业报告生成。</w:t>
+        <w:t>的占用。本地产生、动作完成及必要实收分别记录，使“已生成报告”和“任务已闭合”在执行中有明确区别。</w:t>
       </w:r>
     </w:p>
     <w:p>
@@ -24005,8 +24241,8 @@
         </w:numPr>
         <w:rPr/>
       </w:pPr>
-      <w:bookmarkStart w:id="54" w:name="__RefHeading___Toc1843_851563711"/>
-      <w:bookmarkStart w:id="55" w:name="整体任务可行性定理"/>
+      <w:bookmarkStart w:id="54" w:name="__RefHeading___Toc1832_4125612531"/>
+      <w:bookmarkStart w:id="55" w:name="整体任务执行条件与闭合检查"/>
       <w:bookmarkEnd w:id="54"/>
       <w:r>
         <w:rPr/>
@@ -24014,7 +24250,7 @@
       </w:r>
       <w:r>
         <w:rPr/>
-        <w:t>整体任务可行性定理</w:t>
+        <w:t>整体任务执行条件与闭合检查</w:t>
       </w:r>
       <w:bookmarkEnd w:id="55"/>
     </w:p>
@@ -24529,30 +24765,9 @@
       </w:pPr>
       <w:r>
         <w:rPr>
-          <w:b/>
-          <w:sz w:val="21"/>
-        </w:rPr>
-        <w:t>定理</w:t>
-      </w:r>
-      <w:r>
-        <w:rPr>
-          <w:b/>
-          <w:sz w:val="21"/>
-        </w:rPr>
-        <w:t>1</w:t>
-      </w:r>
-      <w:r>
-        <w:rPr>
-          <w:b/>
-          <w:sz w:val="21"/>
-        </w:rPr>
-        <w:t>：协同任务整体有限完成。</w:t>
-      </w:r>
-      <w:r>
-        <w:rPr>
-          <w:sz w:val="21"/>
-        </w:rPr>
-        <w:t xml:space="preserve"> 对有限请求，若完整活动和信息图无环、方法入口合法、必需曲线具有满足式（</w:t>
+          <w:sz w:val="21"/>
+        </w:rPr>
+        <w:t>整个协同任务需要同时核对活动依赖、方法入口、运动包络、作业进度、支援及终态。活动和信息图应无环；各模式按合法入口接管；相关曲线和跟踪条件满足式（</w:t>
       </w:r>
       <w:r>
         <w:rPr>
@@ -24600,19 +24815,7 @@
         <w:rPr>
           <w:sz w:val="21"/>
         </w:rPr>
-        <w:t>）的工作管、转换和停稳交接有限、服务覆盖必要交付且接收与核实延迟有限、有限次修复后的剩余方案仍满足上述条件，并在有限时刻获得返回授权，则存在按式（</w:t>
-      </w:r>
-      <w:r>
-        <w:rPr>
-          <w:sz w:val="21"/>
-        </w:rPr>
-        <w:t>15</w:t>
-      </w:r>
-      <w:r>
-        <w:rPr>
-          <w:sz w:val="21"/>
-        </w:rPr>
-        <w:t>）实施的执行，使</w:t>
+        <w:t>）；转换、停稳和交接能够合法结束；必要报告具有有效交付机会。规定返回在授权后执行，剩余作业调整从实际状态接续。使用安全允许集合和终止集合，可将完整任务的执行目标写为</w:t>
       </w:r>
     </w:p>
     <w:tbl>
@@ -24891,16 +25094,9 @@
       </w:pPr>
       <w:r>
         <w:rPr>
-          <w:b/>
-          <w:sz w:val="21"/>
-        </w:rPr>
-        <w:t>证明：</w:t>
-      </w:r>
-      <w:r>
-        <w:rPr>
-          <w:sz w:val="21"/>
-        </w:rPr>
-        <w:t xml:space="preserve"> 由式（</w:t>
+          <w:sz w:val="21"/>
+        </w:rPr>
+        <w:t>式（</w:t>
       </w:r>
       <w:r>
         <w:rPr>
@@ -24912,7 +25108,7 @@
         <w:rPr>
           <w:sz w:val="21"/>
         </w:rPr>
-        <w:t>）得到模式误差包络，交接映射将实际末态传入下一模式。式（</w:t>
+        <w:t>）描述模式内的误差包络，交接映射将实际末态传入下一模式；式（</w:t>
       </w:r>
       <w:r>
         <w:rPr>
@@ -24924,7 +25120,7 @@
         <w:rPr>
           <w:sz w:val="21"/>
         </w:rPr>
-        <w:t>）传递为实际净距，式（</w:t>
+        <w:t>）把参考余量和跟踪误差关联到实际净距；式（</w:t>
       </w:r>
       <w:r>
         <w:rPr>
@@ -24936,46 +25132,7 @@
         <w:rPr>
           <w:sz w:val="21"/>
         </w:rPr>
-        <w:t>）保持环境包络，命题</w:t>
-      </w:r>
-      <w:r>
-        <w:rPr>
-          <w:sz w:val="21"/>
-        </w:rPr>
-        <w:t>2</w:t>
-      </w:r>
-      <w:r>
-        <w:rPr>
-          <w:sz w:val="21"/>
-        </w:rPr>
-        <w:t xml:space="preserve">保证互斥，故执行保持在 </w:t>
-      </w:r>
-      <w:r>
-        <w:rPr/>
-      </w:r>
-      <m:oMath xmlns:m="http://schemas.openxmlformats.org/officeDocument/2006/math">
-        <m:sSub>
-          <m:e>
-            <m:r>
-              <m:rPr>
-                <m:lit/>
-                <m:nor/>
-              </m:rPr>
-              <m:t xml:space="preserve">𝒳</m:t>
-            </m:r>
-          </m:e>
-          <m:sub>
-            <m:r>
-              <m:t xml:space="preserve">s</m:t>
-            </m:r>
-          </m:sub>
-        </m:sSub>
-      </m:oMath>
-      <w:r>
-        <w:rPr>
-          <w:sz w:val="21"/>
-        </w:rPr>
-        <w:t>。</w:t>
+        <w:t>）检查环境包络；资源占用规则则协调同时执行的活动。这些条件为运动与资源的一致性检查提供依据。</w:t>
       </w:r>
     </w:p>
     <w:p>
@@ -24987,7 +25144,7 @@
         <w:rPr>
           <w:sz w:val="21"/>
         </w:rPr>
-        <w:t>由式（</w:t>
+        <w:t>式（</w:t>
       </w:r>
       <w:r>
         <w:rPr>
@@ -24999,132 +25156,7 @@
         <w:rPr>
           <w:sz w:val="21"/>
         </w:rPr>
-        <w:t xml:space="preserve">）积分，有 </w:t>
-      </w:r>
-      <w:r>
-        <w:rPr/>
-      </w:r>
-      <m:oMath xmlns:m="http://schemas.openxmlformats.org/officeDocument/2006/math">
-        <m:r>
-          <m:t xml:space="preserve">s</m:t>
-        </m:r>
-        <m:r>
-          <m:rPr>
-            <m:lit/>
-            <m:nor/>
-          </m:rPr>
-          <m:t xml:space="preserve">(</m:t>
-        </m:r>
-        <m:r>
-          <m:t xml:space="preserve">t</m:t>
-        </m:r>
-        <m:r>
-          <m:rPr>
-            <m:lit/>
-            <m:nor/>
-          </m:rPr>
-          <m:t xml:space="preserve">)</m:t>
-        </m:r>
-        <m:r>
-          <m:rPr>
-            <m:lit/>
-            <m:nor/>
-          </m:rPr>
-          <m:t xml:space="preserve">−</m:t>
-        </m:r>
-        <m:r>
-          <m:t xml:space="preserve">s</m:t>
-        </m:r>
-        <m:r>
-          <m:rPr>
-            <m:lit/>
-            <m:nor/>
-          </m:rPr>
-          <m:t xml:space="preserve">(</m:t>
-        </m:r>
-        <m:sSub>
-          <m:e>
-            <m:r>
-              <m:t xml:space="preserve">t</m:t>
-            </m:r>
-          </m:e>
-          <m:sub>
-            <m:r>
-              <m:t xml:space="preserve">0</m:t>
-            </m:r>
-          </m:sub>
-        </m:sSub>
-        <m:r>
-          <m:rPr>
-            <m:lit/>
-            <m:nor/>
-          </m:rPr>
-          <m:t xml:space="preserve">)</m:t>
-        </m:r>
-        <m:r>
-          <m:rPr>
-            <m:lit/>
-            <m:nor/>
-          </m:rPr>
-          <m:t xml:space="preserve">≥</m:t>
-        </m:r>
-        <m:r>
-          <m:t xml:space="preserve">ν</m:t>
-        </m:r>
-        <m:r>
-          <m:rPr>
-            <m:lit/>
-            <m:nor/>
-          </m:rPr>
-          <m:t xml:space="preserve">(</m:t>
-        </m:r>
-        <m:r>
-          <m:t xml:space="preserve">t</m:t>
-        </m:r>
-        <m:r>
-          <m:rPr>
-            <m:lit/>
-            <m:nor/>
-          </m:rPr>
-          <m:t xml:space="preserve">−</m:t>
-        </m:r>
-        <m:sSub>
-          <m:e>
-            <m:r>
-              <m:t xml:space="preserve">t</m:t>
-            </m:r>
-          </m:e>
-          <m:sub>
-            <m:r>
-              <m:t xml:space="preserve">0</m:t>
-            </m:r>
-          </m:sub>
-        </m:sSub>
-        <m:r>
-          <m:rPr>
-            <m:lit/>
-            <m:nor/>
-          </m:rPr>
-          <m:t xml:space="preserve">)</m:t>
-        </m:r>
-      </m:oMath>
-      <w:r>
-        <w:rPr>
-          <w:sz w:val="21"/>
-        </w:rPr>
-        <w:t>，有限空间段被实际经过。合格条件使经过区间有效，命题</w:t>
-      </w:r>
-      <w:r>
-        <w:rPr>
-          <w:sz w:val="21"/>
-        </w:rPr>
-        <w:t>3</w:t>
-      </w:r>
-      <w:r>
-        <w:rPr>
-          <w:sz w:val="21"/>
-        </w:rPr>
-        <w:t>累计成完整作业；驻留、转换、停稳和交接由式（</w:t>
+        <w:t>）在适用的曲线和跟踪条件下给出实际弧长进度下界。相应经过区间满足作业要求时，区间并集可累计完整巡视范围。驻留、转换、停稳和交接分别按其实际完成条件核对，式（</w:t>
       </w:r>
       <w:r>
         <w:rPr>
@@ -25136,7 +25168,7 @@
         <w:rPr>
           <w:sz w:val="21"/>
         </w:rPr>
-        <w:t>）给出上界，因此每项活动有限完成。</w:t>
+        <w:t>）给出条件适用时的活动时长分析。仿真结果还需依据实际状态、合格区间及终态记录进行验证。</w:t>
       </w:r>
     </w:p>
     <w:p>
@@ -25148,7 +25180,7 @@
         <w:rPr>
           <w:sz w:val="21"/>
         </w:rPr>
-        <w:t>将报告生成、服务就绪、接收和核实作为事件节点，按拓扑序递推</w:t>
+        <w:t>报告生成、服务就绪、接收和核实可作为事件节点进入活动图。若相应活动和事件具有适用的持续时间上界，按拓扑顺序可以计算整体时间上界</w:t>
       </w:r>
     </w:p>
     <w:tbl>
@@ -25511,7 +25543,7 @@
         <w:rPr>
           <w:sz w:val="21"/>
         </w:rPr>
-        <w:t>事件持续时间取对应核实或接收界，</w:t>
+        <w:t>事件持续时间取对应的核实或接收界，</w:t>
       </w:r>
       <w:r>
         <w:rPr/>
@@ -25534,19 +25566,7 @@
         <w:rPr>
           <w:sz w:val="21"/>
         </w:rPr>
-        <w:t xml:space="preserve"> 包含资源及授权时刻。前驱有限完成和延迟界使后继有限放行，服务保持至必要实收，命题</w:t>
-      </w:r>
-      <w:r>
-        <w:rPr>
-          <w:sz w:val="21"/>
-        </w:rPr>
-        <w:t>4</w:t>
-      </w:r>
-      <w:r>
-        <w:rPr>
-          <w:sz w:val="21"/>
-        </w:rPr>
-        <w:t>保障关联正确，返回运动同样完成。</w:t>
+        <w:t xml:space="preserve"> 包含资源及授权时刻。该式用于模型条件下的时间分析，不代替执行端对实际完成的判断。服务保持至必要实收，动作和报告按当前版本关联；返回也需要实际终态。</w:t>
       </w:r>
     </w:p>
     <w:p>
@@ -25558,46 +25578,7 @@
         <w:rPr>
           <w:sz w:val="21"/>
         </w:rPr>
-        <w:t xml:space="preserve">修复保留有效完成量并从实际状态建立剩余图，有限次有限时间之和仍有限。所有终止条件成立且锁释放，达到 </w:t>
-      </w:r>
-      <w:r>
-        <w:rPr/>
-      </w:r>
-      <m:oMath xmlns:m="http://schemas.openxmlformats.org/officeDocument/2006/math">
-        <m:sSub>
-          <m:e>
-            <m:r>
-              <m:rPr>
-                <m:lit/>
-                <m:nor/>
-              </m:rPr>
-              <m:t xml:space="preserve">𝒳</m:t>
-            </m:r>
-          </m:e>
-          <m:sub>
-            <m:r>
-              <m:t xml:space="preserve">f</m:t>
-            </m:r>
-          </m:sub>
-        </m:sSub>
-      </m:oMath>
-      <w:r>
-        <w:rPr>
-          <w:sz w:val="21"/>
-        </w:rPr>
-        <w:t>，定理得证。</w:t>
-      </w:r>
-    </w:p>
-    <w:p>
-      <w:pPr>
-        <w:pStyle w:val="Normal"/>
-        <w:rPr/>
-      </w:pPr>
-      <w:r>
-        <w:rPr>
-          <w:sz w:val="21"/>
-        </w:rPr>
-        <w:t>整体定理将分工、连续运动、合格作业、实收和返回贯通为一条推导。工作几何、模式跟踪与服务是模型条件，执行端检查和任务层反馈共同落实这些条件。</w:t>
+        <w:t>发生偏差后，修复保留有效完成量并从实际状态建立剩余图。系统只有在规定作业合格、必要报告已收、规定返回核实且相关占用释放后，才记录完整任务闭合。由此把任务分配、连续运动、完成量计算和结果反馈关联起来，后续通过三业务运行记录核对各项执行结果。</w:t>
       </w:r>
     </w:p>
     <w:p>
@@ -25609,7 +25590,7 @@
         </w:numPr>
         <w:rPr/>
       </w:pPr>
-      <w:bookmarkStart w:id="56" w:name="__RefHeading___Toc1845_851563711"/>
+      <w:bookmarkStart w:id="56" w:name="__RefHeading___Toc1834_4125612531"/>
       <w:bookmarkStart w:id="57" w:name="三类业务协同仿真与结果分析"/>
       <w:bookmarkEnd w:id="56"/>
       <w:r>
@@ -25631,7 +25612,7 @@
         </w:numPr>
         <w:rPr/>
       </w:pPr>
-      <w:bookmarkStart w:id="58" w:name="__RefHeading___Toc1847_851563711"/>
+      <w:bookmarkStart w:id="58" w:name="__RefHeading___Toc1836_4125612531"/>
       <w:bookmarkStart w:id="59" w:name="仿真环境与记录方法"/>
       <w:bookmarkEnd w:id="58"/>
       <w:r>
@@ -26569,7 +26550,7 @@
         </w:numPr>
         <w:rPr/>
       </w:pPr>
-      <w:bookmarkStart w:id="60" w:name="__RefHeading___Toc1849_851563711"/>
+      <w:bookmarkStart w:id="60" w:name="__RefHeading___Toc1838_4125612531"/>
       <w:bookmarkStart w:id="61" w:name="a区域调查"/>
       <w:bookmarkEnd w:id="60"/>
       <w:r>
@@ -26821,7 +26802,7 @@
         </w:numPr>
         <w:rPr/>
       </w:pPr>
-      <w:bookmarkStart w:id="62" w:name="__RefHeading___Toc1851_851563711"/>
+      <w:bookmarkStart w:id="62" w:name="__RefHeading___Toc1840_4125612531"/>
       <w:bookmarkStart w:id="63" w:name="b风机巡检"/>
       <w:bookmarkEnd w:id="62"/>
       <w:r>
@@ -27275,7 +27256,7 @@
         </w:numPr>
         <w:rPr/>
       </w:pPr>
-      <w:bookmarkStart w:id="64" w:name="__RefHeading___Toc1853_851563711"/>
+      <w:bookmarkStart w:id="64" w:name="__RefHeading___Toc1842_4125612531"/>
       <w:bookmarkStart w:id="65" w:name="c平台及管路巡检"/>
       <w:bookmarkEnd w:id="64"/>
       <w:r>
@@ -27621,7 +27602,7 @@
         </w:numPr>
         <w:rPr/>
       </w:pPr>
-      <w:bookmarkStart w:id="66" w:name="__RefHeading___Toc1855_851563711"/>
+      <w:bookmarkStart w:id="66" w:name="__RefHeading___Toc1844_4125612531"/>
       <w:bookmarkStart w:id="67" w:name="实际反馈驱动支援调整"/>
       <w:bookmarkEnd w:id="66"/>
       <w:r>
@@ -27897,7 +27878,7 @@
         </w:numPr>
         <w:rPr/>
       </w:pPr>
-      <w:bookmarkStart w:id="68" w:name="__RefHeading___Toc1857_851563711"/>
+      <w:bookmarkStart w:id="68" w:name="__RefHeading___Toc1846_4125612531"/>
       <w:bookmarkStart w:id="69" w:name="结果统计"/>
       <w:bookmarkEnd w:id="68"/>
       <w:r>
@@ -29491,7 +29472,7 @@
         </w:numPr>
         <w:rPr/>
       </w:pPr>
-      <w:bookmarkStart w:id="70" w:name="__RefHeading___Toc1859_851563711"/>
+      <w:bookmarkStart w:id="70" w:name="__RefHeading___Toc1848_4125612531"/>
       <w:bookmarkStart w:id="71" w:name="结论"/>
       <w:bookmarkEnd w:id="70"/>
       <w:r>
@@ -29609,7 +29590,7 @@
         <w:rPr>
           <w:sz w:val="21"/>
         </w:rPr>
-        <w:t>由误差、曲线正进度、资源和计量不变量推导整体有限完成定理。</w:t>
+        <w:t>结合误差分析、曲线进度、资源占用和报告关联，给出规定作业完成及整体任务闭合的检查条件。</w:t>
       </w:r>
       <w:r>
         <w:rPr>
@@ -29705,7 +29686,7 @@
         <w:rPr>
           <w:sz w:val="21"/>
         </w:rPr>
-        <w:t>独立检查通过，为多种任务共用规划与控制方法提供理论和仿真依据。</w:t>
+        <w:t>独立检查通过，为多种任务共用规划与控制方法提供模型分析和仿真依据。</w:t>
       </w:r>
     </w:p>
     <w:p>
@@ -29732,7 +29713,7 @@
         </w:numPr>
         <w:rPr/>
       </w:pPr>
-      <w:bookmarkStart w:id="72" w:name="__RefHeading___Toc1861_851563711"/>
+      <w:bookmarkStart w:id="72" w:name="__RefHeading___Toc1850_4125612531"/>
       <w:bookmarkStart w:id="73" w:name="参考文献"/>
       <w:bookmarkEnd w:id="72"/>
       <w:r>
@@ -29762,7 +29743,7 @@
         <w:rPr>
           <w:sz w:val="21"/>
         </w:rPr>
-        <w:t>[2] NEVILLE G, CHERNOVA S, RAVICHANDAR H. D-ITAGS: A dynamic interleaved approach to resilient task allocation, scheduling, and motion planning[J/OL]. IEEE Robotics and Automation Letters, 2023[2026-10-09]. https://star-lab.cc.gatech.edu/papers/neville-ditags/.</w:t>
+        <w:t>[2] MESSING A, NEVILLE G, HUTCHINSON S, et al. GRSTAPS: Graphically recursive simultaneous task allocation, planning, and scheduling[J/OL]. The International Journal of Robotics Research, 2022[2026-10-09]. DOI:10.1177/02783649211052066.</w:t>
       </w:r>
     </w:p>
     <w:p>
@@ -29774,7 +29755,7 @@
         <w:rPr>
           <w:sz w:val="21"/>
         </w:rPr>
-        <w:t>[3] QUAN L, YIN L, XU C, et al. Distributed swarm trajectory optimization for formation flight in dense environments[C/OL]//2022 IEEE International Conference on Robotics and Automation. 2022[2026-10-09]. https://arxiv.org/abs/2109.07682.</w:t>
+        <w:t>[3] NEVILLE G, MESSING A, RAVICHANDAR H, et al. An interleaved approach to trait-based task allocation and scheduling[C/OL]//2021 IEEE/RSJ International Conference on Intelligent Robots and Systems. 2021[2026-10-09]. https://arxiv.org/abs/2108.02773.</w:t>
       </w:r>
     </w:p>
     <w:p>
@@ -29786,7 +29767,7 @@
         <w:rPr>
           <w:sz w:val="21"/>
         </w:rPr>
-        <w:t>[4] FOSSEN T I. Handbook of marine craft hydrodynamics and motion control[M]. 2nd ed. Hoboken: Wiley, 2021.</w:t>
+        <w:t>[4] NEVILLE G, CHERNOVA S, RAVICHANDAR H. D-ITAGS: A dynamic interleaved approach to resilient task allocation, scheduling, and motion planning[J/OL]. IEEE Robotics and Automation Letters, 2023[2026-10-09]. https://star-lab.cc.gatech.edu/papers/neville-ditags/.</w:t>
       </w:r>
     </w:p>
     <w:p>
@@ -29798,7 +29779,7 @@
         <w:rPr>
           <w:sz w:val="21"/>
         </w:rPr>
-        <w:t>[5] FOSSEN T I, PETTERSEN K Y. On uniform semiglobal exponential stability (USGES) of proportional line-of-sight guidance laws[J]. Automatica, 2014, 50(11):2912-2917. DOI:10.1016/j.automatica.2014.10.018.</w:t>
+        <w:t>[5] MESSING A, BANFI J, STADLER M, et al. A sampling-based approach for heterogeneous coalition scheduling with temporal uncertainty[C/OL]//Robotics: Science and Systems XIX. 2023[2026-10-09]. https://www.roboticsproceedings.org/rss19/p107.pdf.</w:t>
       </w:r>
     </w:p>
     <w:p>
@@ -29810,7 +29791,7 @@
         <w:rPr>
           <w:sz w:val="21"/>
         </w:rPr>
-        <w:t>[6] GALCERAN E, CAMPOS R, PALOMERAS N, et al. Coverage path planning with real-time replanning and surface reconstruction for inspection of three-dimensional underwater structures using autonomous underwater vehicles[J]. Journal of Field Robotics, 2015, 32(7):952-983. DOI:10.1002/rob.21554.</w:t>
+        <w:t>[6] HUANG P, LIU R, AGGARWAL S, et al. APEX-MR: Multi-robot asynchronous planning and execution for cooperative assembly[C/OL]//Robotics: Science and Systems XXI. 2025[2026-10-09]. DOI:10.15607/RSS.2025.XXI.098.</w:t>
       </w:r>
     </w:p>
     <w:p>
@@ -29822,7 +29803,7 @@
         <w:rPr>
           <w:sz w:val="21"/>
         </w:rPr>
-        <w:t>[7] CASTELAR WEMBERS C, PFLUGHAUPT J, MOSHAGEN L, et al. LiDAR-based automated UAV inspection of wind turbine rotor blades[J]. Journal of Field Robotics, 2024, 41(4):1116-1132. DOI:10.1002/rob.22309.</w:t>
+        <w:t>[7] QUAN L, YIN L, XU C, et al. Distributed swarm trajectory optimization for formation flight in dense environments[C/OL]//2022 IEEE International Conference on Robotics and Automation. 2022[2026-10-09]. https://arxiv.org/abs/2109.07682.</w:t>
       </w:r>
     </w:p>
     <w:p>
@@ -29834,7 +29815,7 @@
         <w:rPr>
           <w:sz w:val="21"/>
         </w:rPr>
-        <w:t>[8] GUO M, ZAVLANOS M M. Multirobot data gathering under buffer constraints and intermittent communication[J]. IEEE Transactions on Robotics, 2018, 34(4):1082-1097. DOI:10.1109/TRO.2018.2830370.</w:t>
+        <w:t>[8] WANG Z, ZHOU X, XU C, et al. Geometrically constrained trajectory optimization for multicopters[J/OL]. IEEE Transactions on Robotics, 2022[2026-10-09]. https://arxiv.org/abs/2103.00190.</w:t>
       </w:r>
     </w:p>
     <w:p>
@@ -29846,7 +29827,7 @@
         <w:rPr>
           <w:sz w:val="21"/>
         </w:rPr>
-        <w:t>[9] FOX D, BURGARD W, THRUN S. The dynamic window approach to collision avoidance[J]. IEEE Robotics &amp; Automation Magazine, 1997, 4(1):23-33. DOI:10.1109/100.580977.</w:t>
+        <w:t>[9] FOSSEN T I. Handbook of marine craft hydrodynamics and motion control[M]. 2nd ed. Hoboken: Wiley, 2021.</w:t>
       </w:r>
     </w:p>
     <w:p>
@@ -29858,7 +29839,7 @@
         <w:rPr>
           <w:sz w:val="21"/>
         </w:rPr>
-        <w:t>[10] KONDO K, FIGUEROA R, RACHED J, et al. Robust MADER: Decentralized multiagent trajectory planner robust to communication delay in dynamic environments[EB/OL]. (2023-12-26)[2026-10-09]. https://arxiv.org/abs/2303.06222.</w:t>
+        <w:t>[10] FOSSEN T I, PETTERSEN K Y. On uniform semiglobal exponential stability (USGES) of proportional line-of-sight guidance laws[J]. Automatica, 2014, 50(11):2912-2917. DOI:10.1016/j.automatica.2014.10.018.</w:t>
       </w:r>
     </w:p>
     <w:p>
@@ -29870,7 +29851,151 @@
         <w:rPr>
           <w:sz w:val="21"/>
         </w:rPr>
-        <w:t>[11] REN Y, ZHU F, LU G, et al. Safety-assured high-speed navigation for MAVs[J]. Science Robotics, 2025, 10(98):eado6187. DOI:10.1126/scirobotics.ado6187.</w:t>
+        <w:t>[11] FOSSEN T I, AGUIAR A P. A uniform semiglobal exponential stable adaptive line-of-sight (ALOS) guidance law for 3-D path following[J]. Automatica, 2024, 163:111556. DOI:10.1016/j.automatica.2024.111556.</w:t>
+      </w:r>
+    </w:p>
+    <w:p>
+      <w:pPr>
+        <w:pStyle w:val="ReportReference"/>
+        <w:rPr/>
+      </w:pPr>
+      <w:r>
+        <w:rPr>
+          <w:sz w:val="21"/>
+        </w:rPr>
+        <w:t>[12] LIU X, DOU M, HUANG D, et al. TJ-FlyingFish: Design and implementation of an aerial-aquatic quadrotor with tiltable propulsion units[C/OL]//2023 IEEE International Conference on Robotics and Automation. 2023[2026-10-09]. https://arxiv.org/abs/2301.12344.</w:t>
+      </w:r>
+    </w:p>
+    <w:p>
+      <w:pPr>
+        <w:pStyle w:val="ReportReference"/>
+        <w:rPr/>
+      </w:pPr>
+      <w:r>
+        <w:rPr>
+          <w:sz w:val="21"/>
+        </w:rPr>
+        <w:t>[13] PINHEIRO P M, NETO A A, GRANDO R B, et al. Trajectory planning for hybrid unmanned aerial underwater vehicles with smooth media transition[EB/OL]. (2021-12-27)[2026-10-09]. https://arxiv.org/abs/2112.13819.</w:t>
+      </w:r>
+    </w:p>
+    <w:p>
+      <w:pPr>
+        <w:pStyle w:val="ReportReference"/>
+        <w:rPr/>
+      </w:pPr>
+      <w:r>
+        <w:rPr>
+          <w:sz w:val="21"/>
+        </w:rPr>
+        <w:t>[14] ZHOU B, ZHANG Y, CHEN X, et al. FUEL: Fast UAV exploration using incremental frontier structure and hierarchical planning[J/OL]. IEEE Robotics and Automation Letters, 2021, 6(2):779-786[2026-10-09]. https://arxiv.org/abs/2010.11561.</w:t>
+      </w:r>
+    </w:p>
+    <w:p>
+      <w:pPr>
+        <w:pStyle w:val="ReportReference"/>
+        <w:rPr/>
+      </w:pPr>
+      <w:r>
+        <w:rPr>
+          <w:sz w:val="21"/>
+        </w:rPr>
+        <w:t>[15] ZHANG Y, CHEN X, FENG C, et al. FALCON: Fast autonomous aerial exploration using coverage path guidance[J/OL]. IEEE Transactions on Robotics, 2025, 41:1365-1385[2026-10-09]. https://arxiv.org/abs/2407.00577.</w:t>
+      </w:r>
+    </w:p>
+    <w:p>
+      <w:pPr>
+        <w:pStyle w:val="ReportReference"/>
+        <w:rPr/>
+      </w:pPr>
+      <w:r>
+        <w:rPr>
+          <w:sz w:val="21"/>
+        </w:rPr>
+        <w:t>[16] HORNUNG A, WURM K M, BENNEWITZ M, et al. OctoMap: An efficient probabilistic 3D mapping framework based on octrees[J]. Autonomous Robots, 2013, 34:189-206. DOI:10.1007/s10514-012-9321-0.</w:t>
+      </w:r>
+    </w:p>
+    <w:p>
+      <w:pPr>
+        <w:pStyle w:val="ReportReference"/>
+        <w:rPr/>
+      </w:pPr>
+      <w:r>
+        <w:rPr>
+          <w:sz w:val="21"/>
+        </w:rPr>
+        <w:t>[17] GALCERAN E, CAMPOS R, PALOMERAS N, et al. Coverage path planning with real-time replanning and surface reconstruction for inspection of three-dimensional underwater structures using autonomous underwater vehicles[J]. Journal of Field Robotics, 2015, 32(7):952-983. DOI:10.1002/rob.21554.</w:t>
+      </w:r>
+    </w:p>
+    <w:p>
+      <w:pPr>
+        <w:pStyle w:val="ReportReference"/>
+        <w:rPr/>
+      </w:pPr>
+      <w:r>
+        <w:rPr>
+          <w:sz w:val="21"/>
+        </w:rPr>
+        <w:t>[18] CASTELAR WEMBERS C, PFLUGHAUPT J, MOSHAGEN L, et al. LiDAR-based automated UAV inspection of wind turbine rotor blades[J]. Journal of Field Robotics, 2024, 41(4):1116-1132. DOI:10.1002/rob.22309.</w:t>
+      </w:r>
+    </w:p>
+    <w:p>
+      <w:pPr>
+        <w:pStyle w:val="ReportReference"/>
+        <w:rPr/>
+      </w:pPr>
+      <w:r>
+        <w:rPr>
+          <w:sz w:val="21"/>
+        </w:rPr>
+        <w:t>[19] GUO M, ZAVLANOS M M. Multirobot data gathering under buffer constraints and intermittent communication[J]. IEEE Transactions on Robotics, 2018, 34(4):1082-1097. DOI:10.1109/TRO.2018.2830370.</w:t>
+      </w:r>
+    </w:p>
+    <w:p>
+      <w:pPr>
+        <w:pStyle w:val="ReportReference"/>
+        <w:rPr/>
+      </w:pPr>
+      <w:r>
+        <w:rPr>
+          <w:sz w:val="21"/>
+        </w:rPr>
+        <w:t>[20] ZHANG X, CHEN J, ZHU Y, et al. CoCoPlan: Adaptive coordination and communication for multi-robot systems in dynamic and unknown environments[J]. IEEE Robotics and Automation Letters, 2026, 11(3):3270-3277. DOI:10.1109/LRA.2026.3656769.</w:t>
+      </w:r>
+    </w:p>
+    <w:p>
+      <w:pPr>
+        <w:pStyle w:val="ReportReference"/>
+        <w:rPr/>
+      </w:pPr>
+      <w:r>
+        <w:rPr>
+          <w:sz w:val="21"/>
+        </w:rPr>
+        <w:t>[21] FOX D, BURGARD W, THRUN S. The dynamic window approach to collision avoidance[J]. IEEE Robotics &amp; Automation Magazine, 1997, 4(1):23-33. DOI:10.1109/100.580977.</w:t>
+      </w:r>
+    </w:p>
+    <w:p>
+      <w:pPr>
+        <w:pStyle w:val="ReportReference"/>
+        <w:rPr/>
+      </w:pPr>
+      <w:r>
+        <w:rPr>
+          <w:sz w:val="21"/>
+        </w:rPr>
+        <w:t>[22] KONDO K, FIGUEROA R, RACHED J, et al. Robust MADER: Decentralized multiagent trajectory planner robust to communication delay in dynamic environments[EB/OL]. (2023-12-26)[2026-10-09]. https://arxiv.org/abs/2303.06222.</w:t>
+      </w:r>
+    </w:p>
+    <w:p>
+      <w:pPr>
+        <w:pStyle w:val="ReportReference"/>
+        <w:rPr/>
+      </w:pPr>
+      <w:r>
+        <w:rPr>
+          <w:sz w:val="21"/>
+        </w:rPr>
+        <w:t>[23] REN Y, ZHU F, LU G, et al. Safety-assured high-speed navigation for MAVs[J]. Science Robotics, 2025, 10(98):eado6187. DOI:10.1126/scirobotics.ado6187.</w:t>
       </w:r>
       <w:r>
         <w:br w:type="page"/>
@@ -29885,7 +30010,7 @@
         </w:numPr>
         <w:rPr/>
       </w:pPr>
-      <w:bookmarkStart w:id="74" w:name="__RefHeading___Toc1863_851563711"/>
+      <w:bookmarkStart w:id="74" w:name="__RefHeading___Toc1852_4125612531"/>
       <w:bookmarkStart w:id="75" w:name="附录a-仿真数据与统计定义"/>
       <w:bookmarkEnd w:id="74"/>
       <w:r>
@@ -30471,7 +30596,7 @@
         </w:numPr>
         <w:rPr/>
       </w:pPr>
-      <w:bookmarkStart w:id="76" w:name="__RefHeading___Toc1865_851563711"/>
+      <w:bookmarkStart w:id="76" w:name="__RefHeading___Toc1854_4125612531"/>
       <w:bookmarkStart w:id="77" w:name="附录b-符号说明"/>
       <w:bookmarkEnd w:id="76"/>
       <w:r>
@@ -31879,7 +32004,7 @@
     </w:r>
     <w:r>
       <w:rPr/>
-      <w:t>21</w:t>
+      <w:t>23</w:t>
     </w:r>
     <w:r>
       <w:rPr/>
@@ -32722,12 +32847,11 @@
       <w:spacing w:before="120" w:after="120"/>
     </w:pPr>
     <w:rPr>
-      <w:rFonts w:cs="Lohit Devanagari" w:eastAsia="黑体"/>
-      <w:i w:val="false"/>
-      <w:iCs w:val="false"/>
-      <w:sz w:val="21"/>
-      <w:szCs w:val="21"/>
-      <w:b w:val="false"/>
+      <w:rFonts w:cs="Lohit Devanagari"/>
+      <w:i/>
+      <w:iCs/>
+      <w:sz w:val="24"/>
+      <w:szCs w:val="24"/>
     </w:rPr>
   </w:style>
   <w:style w:type="paragraph" w:styleId="Index">

</xml_diff>